<commit_message>
Agregar nombres de los Integrantes del proyecto
</commit_message>
<xml_diff>
--- a/RequerimientosSistemasFacturacionLavautos.docx
+++ b/RequerimientosSistemasFacturacionLavautos.docx
@@ -24,6 +24,71 @@
         <w:t>Lavautos</w:t>
       </w:r>
       <w:proofErr w:type="spellEnd"/>
+    </w:p>
+    <w:p>
+      <w:pPr>
+        <w:rPr>
+          <w:lang w:val="es-MX"/>
+        </w:rPr>
+      </w:pPr>
+    </w:p>
+    <w:p>
+      <w:pPr>
+        <w:rPr>
+          <w:lang w:val="es-MX"/>
+        </w:rPr>
+      </w:pPr>
+      <w:r>
+        <w:rPr>
+          <w:lang w:val="es-MX"/>
+        </w:rPr>
+        <w:t>Desarrolladores:</w:t>
+      </w:r>
+    </w:p>
+    <w:p>
+      <w:pPr>
+        <w:rPr>
+          <w:lang w:val="es-MX"/>
+        </w:rPr>
+      </w:pPr>
+      <w:r>
+        <w:rPr>
+          <w:lang w:val="es-MX"/>
+        </w:rPr>
+        <w:t>Sofia García</w:t>
+      </w:r>
+    </w:p>
+    <w:p>
+      <w:pPr>
+        <w:rPr>
+          <w:lang w:val="es-MX"/>
+        </w:rPr>
+      </w:pPr>
+      <w:r>
+        <w:rPr>
+          <w:lang w:val="es-MX"/>
+        </w:rPr>
+        <w:t>José Miguel Patiño</w:t>
+      </w:r>
+      <w:r>
+        <w:rPr>
+          <w:lang w:val="es-MX"/>
+        </w:rPr>
+        <w:tab/>
+      </w:r>
+    </w:p>
+    <w:p>
+      <w:pPr>
+        <w:rPr>
+          <w:lang w:val="es-MX"/>
+        </w:rPr>
+      </w:pPr>
+      <w:r>
+        <w:rPr>
+          <w:lang w:val="es-MX"/>
+        </w:rPr>
+        <w:t>Juan Alejandro Valencia</w:t>
+      </w:r>
     </w:p>
     <w:sectPr>
       <w:pgSz w:w="12240" w:h="15840"/>

</xml_diff>

<commit_message>
Modificacion De Documento De Requerimiento
</commit_message>
<xml_diff>
--- a/RequerimientosSistemasFacturacionLavautos.docx
+++ b/RequerimientosSistemasFacturacionLavautos.docx
@@ -88,6 +88,63 @@
           <w:lang w:val="es-MX"/>
         </w:rPr>
         <w:t>Juan Alejandro Valencia</w:t>
+      </w:r>
+    </w:p>
+    <w:p>
+      <w:pPr>
+        <w:rPr>
+          <w:lang w:val="es-MX"/>
+        </w:rPr>
+      </w:pPr>
+    </w:p>
+    <w:p>
+      <w:pPr>
+        <w:rPr>
+          <w:b/>
+          <w:bCs/>
+          <w:lang w:val="es-MX"/>
+        </w:rPr>
+      </w:pPr>
+      <w:r>
+        <w:rPr>
+          <w:b/>
+          <w:bCs/>
+          <w:lang w:val="es-MX"/>
+        </w:rPr>
+        <w:t>Requerimientos del sistema</w:t>
+      </w:r>
+    </w:p>
+    <w:p>
+      <w:pPr>
+        <w:rPr>
+          <w:lang w:val="es-MX"/>
+        </w:rPr>
+      </w:pPr>
+      <w:r>
+        <w:rPr>
+          <w:lang w:val="es-MX"/>
+        </w:rPr>
+        <w:t xml:space="preserve">Se debe </w:t>
+      </w:r>
+      <w:r>
+        <w:rPr>
+          <w:lang w:val="es-MX"/>
+        </w:rPr>
+        <w:t xml:space="preserve">implementar un sistema de registro de facturación de servicios de </w:t>
+      </w:r>
+      <w:proofErr w:type="gramStart"/>
+      <w:r>
+        <w:rPr>
+          <w:lang w:val="es-MX"/>
+        </w:rPr>
+        <w:t>un lava</w:t>
+      </w:r>
+      <w:proofErr w:type="gramEnd"/>
+      <w:r>
+        <w:rPr>
+          <w:lang w:val="es-MX"/>
+        </w:rPr>
+        <w:t xml:space="preserve"> autos </w:t>
       </w:r>
     </w:p>
     <w:sectPr>

</xml_diff>

<commit_message>
Agregar ejemplo caso de uso iniciar sesion
</commit_message>
<xml_diff>
--- a/RequerimientosSistemasFacturacionLavautos.docx
+++ b/RequerimientosSistemasFacturacionLavautos.docx
@@ -146,6 +146,1691 @@
         </w:rPr>
         <w:t xml:space="preserve"> autos </w:t>
       </w:r>
+    </w:p>
+    <w:p>
+      <w:pPr>
+        <w:rPr>
+          <w:lang w:val="es-MX"/>
+        </w:rPr>
+      </w:pPr>
+      <w:r>
+        <w:rPr>
+          <w:lang w:val="es-MX"/>
+        </w:rPr>
+        <w:br w:type="page"/>
+      </w:r>
+    </w:p>
+    <w:p>
+      <w:pPr>
+        <w:rPr>
+          <w:lang w:val="es-MX"/>
+        </w:rPr>
+      </w:pPr>
+      <w:r>
+        <w:rPr>
+          <w:lang w:val="es-MX"/>
+        </w:rPr>
+        <w:lastRenderedPageBreak/>
+        <w:br w:type="page"/>
+      </w:r>
+    </w:p>
+    <w:p>
+      <w:pPr>
+        <w:rPr>
+          <w:b/>
+          <w:bCs/>
+        </w:rPr>
+      </w:pPr>
+      <w:r>
+        <w:rPr>
+          <w:b/>
+          <w:bCs/>
+        </w:rPr>
+        <w:lastRenderedPageBreak/>
+        <w:t>Ejemplo diligenciado (UC-01: Iniciar sesión)</w:t>
+      </w:r>
+    </w:p>
+    <w:p>
+      <w:pPr>
+        <w:rPr>
+          <w:b/>
+          <w:bCs/>
+        </w:rPr>
+      </w:pPr>
+      <w:r>
+        <w:rPr>
+          <w:b/>
+          <w:bCs/>
+        </w:rPr>
+        <w:t>Resumen</w:t>
+      </w:r>
+    </w:p>
+    <w:tbl>
+      <w:tblPr>
+        <w:tblW w:w="0" w:type="auto"/>
+        <w:tblCellSpacing w:w="15" w:type="dxa"/>
+        <w:tblCellMar>
+          <w:top w:w="15" w:type="dxa"/>
+          <w:left w:w="15" w:type="dxa"/>
+          <w:bottom w:w="15" w:type="dxa"/>
+          <w:right w:w="15" w:type="dxa"/>
+        </w:tblCellMar>
+        <w:tblLook w:val="04A0" w:firstRow="1" w:lastRow="0" w:firstColumn="1" w:lastColumn="0" w:noHBand="0" w:noVBand="1"/>
+      </w:tblPr>
+      <w:tblGrid>
+        <w:gridCol w:w="2324"/>
+        <w:gridCol w:w="6514"/>
+      </w:tblGrid>
+      <w:tr>
+        <w:trPr>
+          <w:tblHeader/>
+          <w:tblCellSpacing w:w="15" w:type="dxa"/>
+        </w:trPr>
+        <w:tc>
+          <w:tcPr>
+            <w:tcW w:w="0" w:type="auto"/>
+            <w:vAlign w:val="center"/>
+            <w:hideMark/>
+          </w:tcPr>
+          <w:p>
+            <w:pPr>
+              <w:rPr>
+                <w:b/>
+                <w:bCs/>
+              </w:rPr>
+            </w:pPr>
+            <w:r>
+              <w:rPr>
+                <w:b/>
+                <w:bCs/>
+              </w:rPr>
+              <w:t>Campo</w:t>
+            </w:r>
+          </w:p>
+        </w:tc>
+        <w:tc>
+          <w:tcPr>
+            <w:tcW w:w="0" w:type="auto"/>
+            <w:vAlign w:val="center"/>
+            <w:hideMark/>
+          </w:tcPr>
+          <w:p>
+            <w:pPr>
+              <w:rPr>
+                <w:b/>
+                <w:bCs/>
+              </w:rPr>
+            </w:pPr>
+            <w:r>
+              <w:rPr>
+                <w:b/>
+                <w:bCs/>
+              </w:rPr>
+              <w:t>Contenido</w:t>
+            </w:r>
+          </w:p>
+        </w:tc>
+      </w:tr>
+      <w:tr>
+        <w:trPr>
+          <w:tblCellSpacing w:w="15" w:type="dxa"/>
+        </w:trPr>
+        <w:tc>
+          <w:tcPr>
+            <w:tcW w:w="0" w:type="auto"/>
+            <w:vAlign w:val="center"/>
+            <w:hideMark/>
+          </w:tcPr>
+          <w:p>
+            <w:r>
+              <w:t>ID</w:t>
+            </w:r>
+          </w:p>
+        </w:tc>
+        <w:tc>
+          <w:tcPr>
+            <w:tcW w:w="0" w:type="auto"/>
+            <w:vAlign w:val="center"/>
+            <w:hideMark/>
+          </w:tcPr>
+          <w:p>
+            <w:r>
+              <w:t>UC-01</w:t>
+            </w:r>
+          </w:p>
+        </w:tc>
+      </w:tr>
+      <w:tr>
+        <w:trPr>
+          <w:tblCellSpacing w:w="15" w:type="dxa"/>
+        </w:trPr>
+        <w:tc>
+          <w:tcPr>
+            <w:tcW w:w="0" w:type="auto"/>
+            <w:vAlign w:val="center"/>
+            <w:hideMark/>
+          </w:tcPr>
+          <w:p>
+            <w:r>
+              <w:t>Nombre</w:t>
+            </w:r>
+          </w:p>
+        </w:tc>
+        <w:tc>
+          <w:tcPr>
+            <w:tcW w:w="0" w:type="auto"/>
+            <w:vAlign w:val="center"/>
+            <w:hideMark/>
+          </w:tcPr>
+          <w:p>
+            <w:r>
+              <w:t>Iniciar sesión</w:t>
+            </w:r>
+          </w:p>
+        </w:tc>
+      </w:tr>
+      <w:tr>
+        <w:trPr>
+          <w:tblCellSpacing w:w="15" w:type="dxa"/>
+        </w:trPr>
+        <w:tc>
+          <w:tcPr>
+            <w:tcW w:w="0" w:type="auto"/>
+            <w:vAlign w:val="center"/>
+            <w:hideMark/>
+          </w:tcPr>
+          <w:p>
+            <w:r>
+              <w:t>Objetivo</w:t>
+            </w:r>
+          </w:p>
+        </w:tc>
+        <w:tc>
+          <w:tcPr>
+            <w:tcW w:w="0" w:type="auto"/>
+            <w:vAlign w:val="center"/>
+            <w:hideMark/>
+          </w:tcPr>
+          <w:p>
+            <w:r>
+              <w:t>Permitir que un usuario acceda al sistema con credenciales válidas</w:t>
+            </w:r>
+          </w:p>
+        </w:tc>
+      </w:tr>
+      <w:tr>
+        <w:trPr>
+          <w:tblCellSpacing w:w="15" w:type="dxa"/>
+        </w:trPr>
+        <w:tc>
+          <w:tcPr>
+            <w:tcW w:w="0" w:type="auto"/>
+            <w:vAlign w:val="center"/>
+            <w:hideMark/>
+          </w:tcPr>
+          <w:p>
+            <w:r>
+              <w:t>Alcance</w:t>
+            </w:r>
+          </w:p>
+        </w:tc>
+        <w:tc>
+          <w:tcPr>
+            <w:tcW w:w="0" w:type="auto"/>
+            <w:vAlign w:val="center"/>
+            <w:hideMark/>
+          </w:tcPr>
+          <w:p>
+            <w:r>
+              <w:t>Autenticación</w:t>
+            </w:r>
+          </w:p>
+        </w:tc>
+      </w:tr>
+      <w:tr>
+        <w:trPr>
+          <w:tblCellSpacing w:w="15" w:type="dxa"/>
+        </w:trPr>
+        <w:tc>
+          <w:tcPr>
+            <w:tcW w:w="0" w:type="auto"/>
+            <w:vAlign w:val="center"/>
+            <w:hideMark/>
+          </w:tcPr>
+          <w:p>
+            <w:r>
+              <w:t>Nivel</w:t>
+            </w:r>
+          </w:p>
+        </w:tc>
+        <w:tc>
+          <w:tcPr>
+            <w:tcW w:w="0" w:type="auto"/>
+            <w:vAlign w:val="center"/>
+            <w:hideMark/>
+          </w:tcPr>
+          <w:p>
+            <w:r>
+              <w:t>Usuario</w:t>
+            </w:r>
+          </w:p>
+        </w:tc>
+      </w:tr>
+      <w:tr>
+        <w:trPr>
+          <w:tblCellSpacing w:w="15" w:type="dxa"/>
+        </w:trPr>
+        <w:tc>
+          <w:tcPr>
+            <w:tcW w:w="0" w:type="auto"/>
+            <w:vAlign w:val="center"/>
+            <w:hideMark/>
+          </w:tcPr>
+          <w:p>
+            <w:r>
+              <w:t>Actor primario</w:t>
+            </w:r>
+          </w:p>
+        </w:tc>
+        <w:tc>
+          <w:tcPr>
+            <w:tcW w:w="0" w:type="auto"/>
+            <w:vAlign w:val="center"/>
+            <w:hideMark/>
+          </w:tcPr>
+          <w:p>
+            <w:r>
+              <w:t>Usuario</w:t>
+            </w:r>
+          </w:p>
+        </w:tc>
+      </w:tr>
+      <w:tr>
+        <w:trPr>
+          <w:tblCellSpacing w:w="15" w:type="dxa"/>
+        </w:trPr>
+        <w:tc>
+          <w:tcPr>
+            <w:tcW w:w="0" w:type="auto"/>
+            <w:vAlign w:val="center"/>
+            <w:hideMark/>
+          </w:tcPr>
+          <w:p>
+            <w:r>
+              <w:t>Actores secundarios</w:t>
+            </w:r>
+          </w:p>
+        </w:tc>
+        <w:tc>
+          <w:tcPr>
+            <w:tcW w:w="0" w:type="auto"/>
+            <w:vAlign w:val="center"/>
+            <w:hideMark/>
+          </w:tcPr>
+          <w:p>
+            <w:r>
+              <w:t>Servicio de autenticación / BD</w:t>
+            </w:r>
+          </w:p>
+        </w:tc>
+      </w:tr>
+      <w:tr>
+        <w:trPr>
+          <w:tblCellSpacing w:w="15" w:type="dxa"/>
+        </w:trPr>
+        <w:tc>
+          <w:tcPr>
+            <w:tcW w:w="0" w:type="auto"/>
+            <w:vAlign w:val="center"/>
+            <w:hideMark/>
+          </w:tcPr>
+          <w:p>
+            <w:r>
+              <w:t>Disparador</w:t>
+            </w:r>
+          </w:p>
+        </w:tc>
+        <w:tc>
+          <w:tcPr>
+            <w:tcW w:w="0" w:type="auto"/>
+            <w:vAlign w:val="center"/>
+            <w:hideMark/>
+          </w:tcPr>
+          <w:p>
+            <w:r>
+              <w:t>Usuario presiona “Iniciar sesión”</w:t>
+            </w:r>
+          </w:p>
+        </w:tc>
+      </w:tr>
+      <w:tr>
+        <w:trPr>
+          <w:tblCellSpacing w:w="15" w:type="dxa"/>
+        </w:trPr>
+        <w:tc>
+          <w:tcPr>
+            <w:tcW w:w="0" w:type="auto"/>
+            <w:vAlign w:val="center"/>
+            <w:hideMark/>
+          </w:tcPr>
+          <w:p>
+            <w:r>
+              <w:t>Precondiciones</w:t>
+            </w:r>
+          </w:p>
+        </w:tc>
+        <w:tc>
+          <w:tcPr>
+            <w:tcW w:w="0" w:type="auto"/>
+            <w:vAlign w:val="center"/>
+            <w:hideMark/>
+          </w:tcPr>
+          <w:p>
+            <w:r>
+              <w:t>Usuario tiene cuenta registrada; el sistema está disponible</w:t>
+            </w:r>
+          </w:p>
+        </w:tc>
+      </w:tr>
+      <w:tr>
+        <w:trPr>
+          <w:tblCellSpacing w:w="15" w:type="dxa"/>
+        </w:trPr>
+        <w:tc>
+          <w:tcPr>
+            <w:tcW w:w="0" w:type="auto"/>
+            <w:vAlign w:val="center"/>
+            <w:hideMark/>
+          </w:tcPr>
+          <w:p>
+            <w:r>
+              <w:t>Postcondiciones (éxito)</w:t>
+            </w:r>
+          </w:p>
+        </w:tc>
+        <w:tc>
+          <w:tcPr>
+            <w:tcW w:w="0" w:type="auto"/>
+            <w:vAlign w:val="center"/>
+            <w:hideMark/>
+          </w:tcPr>
+          <w:p>
+            <w:r>
+              <w:t xml:space="preserve">Sesión activa; se redirige al </w:t>
+            </w:r>
+            <w:proofErr w:type="spellStart"/>
+            <w:r>
+              <w:t>dashboard</w:t>
+            </w:r>
+            <w:proofErr w:type="spellEnd"/>
+          </w:p>
+        </w:tc>
+      </w:tr>
+      <w:tr>
+        <w:trPr>
+          <w:tblCellSpacing w:w="15" w:type="dxa"/>
+        </w:trPr>
+        <w:tc>
+          <w:tcPr>
+            <w:tcW w:w="0" w:type="auto"/>
+            <w:vAlign w:val="center"/>
+            <w:hideMark/>
+          </w:tcPr>
+          <w:p>
+            <w:r>
+              <w:t>Postcondiciones (fallo)</w:t>
+            </w:r>
+          </w:p>
+        </w:tc>
+        <w:tc>
+          <w:tcPr>
+            <w:tcW w:w="0" w:type="auto"/>
+            <w:vAlign w:val="center"/>
+            <w:hideMark/>
+          </w:tcPr>
+          <w:p>
+            <w:r>
+              <w:t>No se crea sesión; se informa el error</w:t>
+            </w:r>
+          </w:p>
+        </w:tc>
+      </w:tr>
+      <w:tr>
+        <w:trPr>
+          <w:tblCellSpacing w:w="15" w:type="dxa"/>
+        </w:trPr>
+        <w:tc>
+          <w:tcPr>
+            <w:tcW w:w="0" w:type="auto"/>
+            <w:vAlign w:val="center"/>
+            <w:hideMark/>
+          </w:tcPr>
+          <w:p>
+            <w:r>
+              <w:t>Reglas de negocio</w:t>
+            </w:r>
+          </w:p>
+        </w:tc>
+        <w:tc>
+          <w:tcPr>
+            <w:tcW w:w="0" w:type="auto"/>
+            <w:vAlign w:val="center"/>
+            <w:hideMark/>
+          </w:tcPr>
+          <w:p>
+            <w:r>
+              <w:t>RB-01 Bloqueo tras N intentos; RB-02 Política de contraseña</w:t>
+            </w:r>
+          </w:p>
+        </w:tc>
+      </w:tr>
+      <w:tr>
+        <w:trPr>
+          <w:tblCellSpacing w:w="15" w:type="dxa"/>
+        </w:trPr>
+        <w:tc>
+          <w:tcPr>
+            <w:tcW w:w="0" w:type="auto"/>
+            <w:vAlign w:val="center"/>
+            <w:hideMark/>
+          </w:tcPr>
+          <w:p>
+            <w:r>
+              <w:t>NFR</w:t>
+            </w:r>
+          </w:p>
+        </w:tc>
+        <w:tc>
+          <w:tcPr>
+            <w:tcW w:w="0" w:type="auto"/>
+            <w:vAlign w:val="center"/>
+            <w:hideMark/>
+          </w:tcPr>
+          <w:p>
+            <w:r>
+              <w:t xml:space="preserve">NFR-01 p95 </w:t>
+            </w:r>
+            <w:proofErr w:type="spellStart"/>
+            <w:r>
+              <w:t>login</w:t>
+            </w:r>
+            <w:proofErr w:type="spellEnd"/>
+            <w:r>
+              <w:t xml:space="preserve"> &lt; 800ms; NFR-02 TLS obligatorio</w:t>
+            </w:r>
+          </w:p>
+        </w:tc>
+      </w:tr>
+    </w:tbl>
+    <w:p>
+      <w:pPr>
+        <w:rPr>
+          <w:b/>
+          <w:bCs/>
+        </w:rPr>
+      </w:pPr>
+      <w:r>
+        <w:rPr>
+          <w:b/>
+          <w:bCs/>
+        </w:rPr>
+        <w:t>Flujo principal</w:t>
+      </w:r>
+    </w:p>
+    <w:tbl>
+      <w:tblPr>
+        <w:tblW w:w="0" w:type="auto"/>
+        <w:tblCellSpacing w:w="15" w:type="dxa"/>
+        <w:tblCellMar>
+          <w:top w:w="15" w:type="dxa"/>
+          <w:left w:w="15" w:type="dxa"/>
+          <w:bottom w:w="15" w:type="dxa"/>
+          <w:right w:w="15" w:type="dxa"/>
+        </w:tblCellMar>
+        <w:tblLook w:val="04A0" w:firstRow="1" w:lastRow="0" w:firstColumn="1" w:lastColumn="0" w:noHBand="0" w:noVBand="1"/>
+      </w:tblPr>
+      <w:tblGrid>
+        <w:gridCol w:w="542"/>
+        <w:gridCol w:w="815"/>
+        <w:gridCol w:w="2027"/>
+        <w:gridCol w:w="3288"/>
+        <w:gridCol w:w="2166"/>
+      </w:tblGrid>
+      <w:tr>
+        <w:trPr>
+          <w:tblHeader/>
+          <w:tblCellSpacing w:w="15" w:type="dxa"/>
+        </w:trPr>
+        <w:tc>
+          <w:tcPr>
+            <w:tcW w:w="0" w:type="auto"/>
+            <w:vAlign w:val="center"/>
+            <w:hideMark/>
+          </w:tcPr>
+          <w:p>
+            <w:pPr>
+              <w:rPr>
+                <w:b/>
+                <w:bCs/>
+              </w:rPr>
+            </w:pPr>
+            <w:r>
+              <w:rPr>
+                <w:b/>
+                <w:bCs/>
+              </w:rPr>
+              <w:t>Paso</w:t>
+            </w:r>
+          </w:p>
+        </w:tc>
+        <w:tc>
+          <w:tcPr>
+            <w:tcW w:w="0" w:type="auto"/>
+            <w:vAlign w:val="center"/>
+            <w:hideMark/>
+          </w:tcPr>
+          <w:p>
+            <w:pPr>
+              <w:rPr>
+                <w:b/>
+                <w:bCs/>
+              </w:rPr>
+            </w:pPr>
+            <w:r>
+              <w:rPr>
+                <w:b/>
+                <w:bCs/>
+              </w:rPr>
+              <w:t>Actor</w:t>
+            </w:r>
+          </w:p>
+        </w:tc>
+        <w:tc>
+          <w:tcPr>
+            <w:tcW w:w="0" w:type="auto"/>
+            <w:vAlign w:val="center"/>
+            <w:hideMark/>
+          </w:tcPr>
+          <w:p>
+            <w:pPr>
+              <w:rPr>
+                <w:b/>
+                <w:bCs/>
+              </w:rPr>
+            </w:pPr>
+            <w:r>
+              <w:rPr>
+                <w:b/>
+                <w:bCs/>
+              </w:rPr>
+              <w:t>Acción</w:t>
+            </w:r>
+          </w:p>
+        </w:tc>
+        <w:tc>
+          <w:tcPr>
+            <w:tcW w:w="0" w:type="auto"/>
+            <w:vAlign w:val="center"/>
+            <w:hideMark/>
+          </w:tcPr>
+          <w:p>
+            <w:pPr>
+              <w:rPr>
+                <w:b/>
+                <w:bCs/>
+              </w:rPr>
+            </w:pPr>
+            <w:r>
+              <w:rPr>
+                <w:b/>
+                <w:bCs/>
+              </w:rPr>
+              <w:t>Sistema</w:t>
+            </w:r>
+          </w:p>
+        </w:tc>
+        <w:tc>
+          <w:tcPr>
+            <w:tcW w:w="0" w:type="auto"/>
+            <w:vAlign w:val="center"/>
+            <w:hideMark/>
+          </w:tcPr>
+          <w:p>
+            <w:pPr>
+              <w:rPr>
+                <w:b/>
+                <w:bCs/>
+              </w:rPr>
+            </w:pPr>
+            <w:r>
+              <w:rPr>
+                <w:b/>
+                <w:bCs/>
+              </w:rPr>
+              <w:t>Resultado/Salida</w:t>
+            </w:r>
+          </w:p>
+        </w:tc>
+      </w:tr>
+      <w:tr>
+        <w:trPr>
+          <w:tblCellSpacing w:w="15" w:type="dxa"/>
+        </w:trPr>
+        <w:tc>
+          <w:tcPr>
+            <w:tcW w:w="0" w:type="auto"/>
+            <w:vAlign w:val="center"/>
+            <w:hideMark/>
+          </w:tcPr>
+          <w:p>
+            <w:r>
+              <w:t>1</w:t>
+            </w:r>
+          </w:p>
+        </w:tc>
+        <w:tc>
+          <w:tcPr>
+            <w:tcW w:w="0" w:type="auto"/>
+            <w:vAlign w:val="center"/>
+            <w:hideMark/>
+          </w:tcPr>
+          <w:p>
+            <w:r>
+              <w:t>Usuario</w:t>
+            </w:r>
+          </w:p>
+        </w:tc>
+        <w:tc>
+          <w:tcPr>
+            <w:tcW w:w="0" w:type="auto"/>
+            <w:vAlign w:val="center"/>
+            <w:hideMark/>
+          </w:tcPr>
+          <w:p>
+            <w:r>
+              <w:t>Ingresa correo y contraseña</w:t>
+            </w:r>
+          </w:p>
+        </w:tc>
+        <w:tc>
+          <w:tcPr>
+            <w:tcW w:w="0" w:type="auto"/>
+            <w:vAlign w:val="center"/>
+            <w:hideMark/>
+          </w:tcPr>
+          <w:p/>
+        </w:tc>
+        <w:tc>
+          <w:tcPr>
+            <w:tcW w:w="0" w:type="auto"/>
+            <w:vAlign w:val="center"/>
+            <w:hideMark/>
+          </w:tcPr>
+          <w:p>
+            <w:r>
+              <w:t>Datos capturados</w:t>
+            </w:r>
+          </w:p>
+        </w:tc>
+      </w:tr>
+      <w:tr>
+        <w:trPr>
+          <w:tblCellSpacing w:w="15" w:type="dxa"/>
+        </w:trPr>
+        <w:tc>
+          <w:tcPr>
+            <w:tcW w:w="0" w:type="auto"/>
+            <w:vAlign w:val="center"/>
+            <w:hideMark/>
+          </w:tcPr>
+          <w:p>
+            <w:r>
+              <w:t>2</w:t>
+            </w:r>
+          </w:p>
+        </w:tc>
+        <w:tc>
+          <w:tcPr>
+            <w:tcW w:w="0" w:type="auto"/>
+            <w:vAlign w:val="center"/>
+            <w:hideMark/>
+          </w:tcPr>
+          <w:p>
+            <w:r>
+              <w:t>Usuario</w:t>
+            </w:r>
+          </w:p>
+        </w:tc>
+        <w:tc>
+          <w:tcPr>
+            <w:tcW w:w="0" w:type="auto"/>
+            <w:vAlign w:val="center"/>
+            <w:hideMark/>
+          </w:tcPr>
+          <w:p>
+            <w:r>
+              <w:t>Presiona “Entrar”</w:t>
+            </w:r>
+          </w:p>
+        </w:tc>
+        <w:tc>
+          <w:tcPr>
+            <w:tcW w:w="0" w:type="auto"/>
+            <w:vAlign w:val="center"/>
+            <w:hideMark/>
+          </w:tcPr>
+          <w:p/>
+        </w:tc>
+        <w:tc>
+          <w:tcPr>
+            <w:tcW w:w="0" w:type="auto"/>
+            <w:vAlign w:val="center"/>
+            <w:hideMark/>
+          </w:tcPr>
+          <w:p>
+            <w:r>
+              <w:t>Solicitud enviada</w:t>
+            </w:r>
+          </w:p>
+        </w:tc>
+      </w:tr>
+      <w:tr>
+        <w:trPr>
+          <w:tblCellSpacing w:w="15" w:type="dxa"/>
+        </w:trPr>
+        <w:tc>
+          <w:tcPr>
+            <w:tcW w:w="0" w:type="auto"/>
+            <w:vAlign w:val="center"/>
+            <w:hideMark/>
+          </w:tcPr>
+          <w:p>
+            <w:r>
+              <w:t>3</w:t>
+            </w:r>
+          </w:p>
+        </w:tc>
+        <w:tc>
+          <w:tcPr>
+            <w:tcW w:w="0" w:type="auto"/>
+            <w:vAlign w:val="center"/>
+            <w:hideMark/>
+          </w:tcPr>
+          <w:p/>
+        </w:tc>
+        <w:tc>
+          <w:tcPr>
+            <w:tcW w:w="0" w:type="auto"/>
+            <w:vAlign w:val="center"/>
+            <w:hideMark/>
+          </w:tcPr>
+          <w:p/>
+        </w:tc>
+        <w:tc>
+          <w:tcPr>
+            <w:tcW w:w="0" w:type="auto"/>
+            <w:vAlign w:val="center"/>
+            <w:hideMark/>
+          </w:tcPr>
+          <w:p>
+            <w:r>
+              <w:t>Valida formato y existencia del usuario</w:t>
+            </w:r>
+          </w:p>
+        </w:tc>
+        <w:tc>
+          <w:tcPr>
+            <w:tcW w:w="0" w:type="auto"/>
+            <w:vAlign w:val="center"/>
+            <w:hideMark/>
+          </w:tcPr>
+          <w:p>
+            <w:r>
+              <w:t>Usuario localizado o falla</w:t>
+            </w:r>
+          </w:p>
+        </w:tc>
+      </w:tr>
+      <w:tr>
+        <w:trPr>
+          <w:tblCellSpacing w:w="15" w:type="dxa"/>
+        </w:trPr>
+        <w:tc>
+          <w:tcPr>
+            <w:tcW w:w="0" w:type="auto"/>
+            <w:vAlign w:val="center"/>
+            <w:hideMark/>
+          </w:tcPr>
+          <w:p>
+            <w:r>
+              <w:lastRenderedPageBreak/>
+              <w:t>4</w:t>
+            </w:r>
+          </w:p>
+        </w:tc>
+        <w:tc>
+          <w:tcPr>
+            <w:tcW w:w="0" w:type="auto"/>
+            <w:vAlign w:val="center"/>
+            <w:hideMark/>
+          </w:tcPr>
+          <w:p/>
+        </w:tc>
+        <w:tc>
+          <w:tcPr>
+            <w:tcW w:w="0" w:type="auto"/>
+            <w:vAlign w:val="center"/>
+            <w:hideMark/>
+          </w:tcPr>
+          <w:p/>
+        </w:tc>
+        <w:tc>
+          <w:tcPr>
+            <w:tcW w:w="0" w:type="auto"/>
+            <w:vAlign w:val="center"/>
+            <w:hideMark/>
+          </w:tcPr>
+          <w:p>
+            <w:r>
+              <w:t>Verifica contraseña y estado (activo/no bloqueado)</w:t>
+            </w:r>
+          </w:p>
+        </w:tc>
+        <w:tc>
+          <w:tcPr>
+            <w:tcW w:w="0" w:type="auto"/>
+            <w:vAlign w:val="center"/>
+            <w:hideMark/>
+          </w:tcPr>
+          <w:p>
+            <w:r>
+              <w:t>Auth OK</w:t>
+            </w:r>
+          </w:p>
+        </w:tc>
+      </w:tr>
+      <w:tr>
+        <w:trPr>
+          <w:tblCellSpacing w:w="15" w:type="dxa"/>
+        </w:trPr>
+        <w:tc>
+          <w:tcPr>
+            <w:tcW w:w="0" w:type="auto"/>
+            <w:vAlign w:val="center"/>
+            <w:hideMark/>
+          </w:tcPr>
+          <w:p>
+            <w:r>
+              <w:t>5</w:t>
+            </w:r>
+          </w:p>
+        </w:tc>
+        <w:tc>
+          <w:tcPr>
+            <w:tcW w:w="0" w:type="auto"/>
+            <w:vAlign w:val="center"/>
+            <w:hideMark/>
+          </w:tcPr>
+          <w:p/>
+        </w:tc>
+        <w:tc>
+          <w:tcPr>
+            <w:tcW w:w="0" w:type="auto"/>
+            <w:vAlign w:val="center"/>
+            <w:hideMark/>
+          </w:tcPr>
+          <w:p/>
+        </w:tc>
+        <w:tc>
+          <w:tcPr>
+            <w:tcW w:w="0" w:type="auto"/>
+            <w:vAlign w:val="center"/>
+            <w:hideMark/>
+          </w:tcPr>
+          <w:p>
+            <w:r>
+              <w:t>Crea sesión / emite token</w:t>
+            </w:r>
+          </w:p>
+        </w:tc>
+        <w:tc>
+          <w:tcPr>
+            <w:tcW w:w="0" w:type="auto"/>
+            <w:vAlign w:val="center"/>
+            <w:hideMark/>
+          </w:tcPr>
+          <w:p>
+            <w:r>
+              <w:t>Sesión/token creado</w:t>
+            </w:r>
+          </w:p>
+        </w:tc>
+      </w:tr>
+      <w:tr>
+        <w:trPr>
+          <w:tblCellSpacing w:w="15" w:type="dxa"/>
+        </w:trPr>
+        <w:tc>
+          <w:tcPr>
+            <w:tcW w:w="0" w:type="auto"/>
+            <w:vAlign w:val="center"/>
+            <w:hideMark/>
+          </w:tcPr>
+          <w:p>
+            <w:r>
+              <w:t>6</w:t>
+            </w:r>
+          </w:p>
+        </w:tc>
+        <w:tc>
+          <w:tcPr>
+            <w:tcW w:w="0" w:type="auto"/>
+            <w:vAlign w:val="center"/>
+            <w:hideMark/>
+          </w:tcPr>
+          <w:p/>
+        </w:tc>
+        <w:tc>
+          <w:tcPr>
+            <w:tcW w:w="0" w:type="auto"/>
+            <w:vAlign w:val="center"/>
+            <w:hideMark/>
+          </w:tcPr>
+          <w:p/>
+        </w:tc>
+        <w:tc>
+          <w:tcPr>
+            <w:tcW w:w="0" w:type="auto"/>
+            <w:vAlign w:val="center"/>
+            <w:hideMark/>
+          </w:tcPr>
+          <w:p>
+            <w:r>
+              <w:t xml:space="preserve">Redirige al </w:t>
+            </w:r>
+            <w:proofErr w:type="spellStart"/>
+            <w:r>
+              <w:t>dashboard</w:t>
+            </w:r>
+            <w:proofErr w:type="spellEnd"/>
+          </w:p>
+        </w:tc>
+        <w:tc>
+          <w:tcPr>
+            <w:tcW w:w="0" w:type="auto"/>
+            <w:vAlign w:val="center"/>
+            <w:hideMark/>
+          </w:tcPr>
+          <w:p>
+            <w:r>
+              <w:t>Acceso concedido</w:t>
+            </w:r>
+          </w:p>
+        </w:tc>
+      </w:tr>
+    </w:tbl>
+    <w:p>
+      <w:pPr>
+        <w:rPr>
+          <w:b/>
+          <w:bCs/>
+        </w:rPr>
+      </w:pPr>
+      <w:r>
+        <w:rPr>
+          <w:b/>
+          <w:bCs/>
+        </w:rPr>
+        <w:t>Alternos</w:t>
+      </w:r>
+    </w:p>
+    <w:tbl>
+      <w:tblPr>
+        <w:tblW w:w="0" w:type="auto"/>
+        <w:tblCellSpacing w:w="15" w:type="dxa"/>
+        <w:tblCellMar>
+          <w:top w:w="15" w:type="dxa"/>
+          <w:left w:w="15" w:type="dxa"/>
+          <w:bottom w:w="15" w:type="dxa"/>
+          <w:right w:w="15" w:type="dxa"/>
+        </w:tblCellMar>
+        <w:tblLook w:val="04A0" w:firstRow="1" w:lastRow="0" w:firstColumn="1" w:lastColumn="0" w:noHBand="0" w:noVBand="1"/>
+      </w:tblPr>
+      <w:tblGrid>
+        <w:gridCol w:w="516"/>
+        <w:gridCol w:w="1437"/>
+        <w:gridCol w:w="1738"/>
+        <w:gridCol w:w="2901"/>
+        <w:gridCol w:w="831"/>
+        <w:gridCol w:w="1415"/>
+      </w:tblGrid>
+      <w:tr>
+        <w:trPr>
+          <w:tblHeader/>
+          <w:tblCellSpacing w:w="15" w:type="dxa"/>
+        </w:trPr>
+        <w:tc>
+          <w:tcPr>
+            <w:tcW w:w="0" w:type="auto"/>
+            <w:vAlign w:val="center"/>
+            <w:hideMark/>
+          </w:tcPr>
+          <w:p>
+            <w:pPr>
+              <w:rPr>
+                <w:b/>
+                <w:bCs/>
+              </w:rPr>
+            </w:pPr>
+            <w:r>
+              <w:rPr>
+                <w:b/>
+                <w:bCs/>
+              </w:rPr>
+              <w:t>ID</w:t>
+            </w:r>
+          </w:p>
+        </w:tc>
+        <w:tc>
+          <w:tcPr>
+            <w:tcW w:w="0" w:type="auto"/>
+            <w:vAlign w:val="center"/>
+            <w:hideMark/>
+          </w:tcPr>
+          <w:p>
+            <w:pPr>
+              <w:rPr>
+                <w:b/>
+                <w:bCs/>
+              </w:rPr>
+            </w:pPr>
+            <w:r>
+              <w:rPr>
+                <w:b/>
+                <w:bCs/>
+              </w:rPr>
+              <w:t>Se desvía en el paso</w:t>
+            </w:r>
+          </w:p>
+        </w:tc>
+        <w:tc>
+          <w:tcPr>
+            <w:tcW w:w="0" w:type="auto"/>
+            <w:vAlign w:val="center"/>
+            <w:hideMark/>
+          </w:tcPr>
+          <w:p>
+            <w:pPr>
+              <w:rPr>
+                <w:b/>
+                <w:bCs/>
+              </w:rPr>
+            </w:pPr>
+            <w:r>
+              <w:rPr>
+                <w:b/>
+                <w:bCs/>
+              </w:rPr>
+              <w:t>Condición</w:t>
+            </w:r>
+          </w:p>
+        </w:tc>
+        <w:tc>
+          <w:tcPr>
+            <w:tcW w:w="0" w:type="auto"/>
+            <w:vAlign w:val="center"/>
+            <w:hideMark/>
+          </w:tcPr>
+          <w:p>
+            <w:pPr>
+              <w:rPr>
+                <w:b/>
+                <w:bCs/>
+              </w:rPr>
+            </w:pPr>
+            <w:r>
+              <w:rPr>
+                <w:b/>
+                <w:bCs/>
+              </w:rPr>
+              <w:t>Pasos (breve)</w:t>
+            </w:r>
+          </w:p>
+        </w:tc>
+        <w:tc>
+          <w:tcPr>
+            <w:tcW w:w="0" w:type="auto"/>
+            <w:vAlign w:val="center"/>
+            <w:hideMark/>
+          </w:tcPr>
+          <w:p>
+            <w:pPr>
+              <w:rPr>
+                <w:b/>
+                <w:bCs/>
+              </w:rPr>
+            </w:pPr>
+            <w:r>
+              <w:rPr>
+                <w:b/>
+                <w:bCs/>
+              </w:rPr>
+              <w:t>Vuelve a</w:t>
+            </w:r>
+          </w:p>
+        </w:tc>
+        <w:tc>
+          <w:tcPr>
+            <w:tcW w:w="0" w:type="auto"/>
+            <w:vAlign w:val="center"/>
+            <w:hideMark/>
+          </w:tcPr>
+          <w:p>
+            <w:pPr>
+              <w:rPr>
+                <w:b/>
+                <w:bCs/>
+              </w:rPr>
+            </w:pPr>
+            <w:r>
+              <w:rPr>
+                <w:b/>
+                <w:bCs/>
+              </w:rPr>
+              <w:t>Resultado</w:t>
+            </w:r>
+          </w:p>
+        </w:tc>
+      </w:tr>
+      <w:tr>
+        <w:trPr>
+          <w:tblCellSpacing w:w="15" w:type="dxa"/>
+        </w:trPr>
+        <w:tc>
+          <w:tcPr>
+            <w:tcW w:w="0" w:type="auto"/>
+            <w:vAlign w:val="center"/>
+            <w:hideMark/>
+          </w:tcPr>
+          <w:p>
+            <w:r>
+              <w:t>FA-01</w:t>
+            </w:r>
+          </w:p>
+        </w:tc>
+        <w:tc>
+          <w:tcPr>
+            <w:tcW w:w="0" w:type="auto"/>
+            <w:vAlign w:val="center"/>
+            <w:hideMark/>
+          </w:tcPr>
+          <w:p>
+            <w:r>
+              <w:t>3</w:t>
+            </w:r>
+          </w:p>
+        </w:tc>
+        <w:tc>
+          <w:tcPr>
+            <w:tcW w:w="0" w:type="auto"/>
+            <w:vAlign w:val="center"/>
+            <w:hideMark/>
+          </w:tcPr>
+          <w:p>
+            <w:r>
+              <w:t>Usuario no existe</w:t>
+            </w:r>
+          </w:p>
+        </w:tc>
+        <w:tc>
+          <w:tcPr>
+            <w:tcW w:w="0" w:type="auto"/>
+            <w:vAlign w:val="center"/>
+            <w:hideMark/>
+          </w:tcPr>
+          <w:p>
+            <w:r>
+              <w:t>Mostrar “usuario o contraseña inválidos”</w:t>
+            </w:r>
+          </w:p>
+        </w:tc>
+        <w:tc>
+          <w:tcPr>
+            <w:tcW w:w="0" w:type="auto"/>
+            <w:vAlign w:val="center"/>
+            <w:hideMark/>
+          </w:tcPr>
+          <w:p>
+            <w:r>
+              <w:t>—</w:t>
+            </w:r>
+          </w:p>
+        </w:tc>
+        <w:tc>
+          <w:tcPr>
+            <w:tcW w:w="0" w:type="auto"/>
+            <w:vAlign w:val="center"/>
+            <w:hideMark/>
+          </w:tcPr>
+          <w:p>
+            <w:r>
+              <w:t>Fallo controlado</w:t>
+            </w:r>
+          </w:p>
+        </w:tc>
+      </w:tr>
+      <w:tr>
+        <w:trPr>
+          <w:tblCellSpacing w:w="15" w:type="dxa"/>
+        </w:trPr>
+        <w:tc>
+          <w:tcPr>
+            <w:tcW w:w="0" w:type="auto"/>
+            <w:vAlign w:val="center"/>
+            <w:hideMark/>
+          </w:tcPr>
+          <w:p>
+            <w:r>
+              <w:t>FA-02</w:t>
+            </w:r>
+          </w:p>
+        </w:tc>
+        <w:tc>
+          <w:tcPr>
+            <w:tcW w:w="0" w:type="auto"/>
+            <w:vAlign w:val="center"/>
+            <w:hideMark/>
+          </w:tcPr>
+          <w:p>
+            <w:r>
+              <w:t>4</w:t>
+            </w:r>
+          </w:p>
+        </w:tc>
+        <w:tc>
+          <w:tcPr>
+            <w:tcW w:w="0" w:type="auto"/>
+            <w:vAlign w:val="center"/>
+            <w:hideMark/>
+          </w:tcPr>
+          <w:p>
+            <w:r>
+              <w:t>Contraseña incorrecta</w:t>
+            </w:r>
+          </w:p>
+        </w:tc>
+        <w:tc>
+          <w:tcPr>
+            <w:tcW w:w="0" w:type="auto"/>
+            <w:vAlign w:val="center"/>
+            <w:hideMark/>
+          </w:tcPr>
+          <w:p>
+            <w:r>
+              <w:t>Aumenta contador; si N intentos → bloqueo</w:t>
+            </w:r>
+          </w:p>
+        </w:tc>
+        <w:tc>
+          <w:tcPr>
+            <w:tcW w:w="0" w:type="auto"/>
+            <w:vAlign w:val="center"/>
+            <w:hideMark/>
+          </w:tcPr>
+          <w:p>
+            <w:r>
+              <w:t>1</w:t>
+            </w:r>
+          </w:p>
+        </w:tc>
+        <w:tc>
+          <w:tcPr>
+            <w:tcW w:w="0" w:type="auto"/>
+            <w:vAlign w:val="center"/>
+            <w:hideMark/>
+          </w:tcPr>
+          <w:p>
+            <w:r>
+              <w:t>Reintento</w:t>
+            </w:r>
+          </w:p>
+        </w:tc>
+      </w:tr>
+    </w:tbl>
+    <w:p>
+      <w:pPr>
+        <w:rPr>
+          <w:b/>
+          <w:bCs/>
+        </w:rPr>
+      </w:pPr>
+      <w:r>
+        <w:rPr>
+          <w:b/>
+          <w:bCs/>
+        </w:rPr>
+        <w:t>Excepciones</w:t>
+      </w:r>
+    </w:p>
+    <w:tbl>
+      <w:tblPr>
+        <w:tblW w:w="0" w:type="auto"/>
+        <w:tblCellSpacing w:w="15" w:type="dxa"/>
+        <w:tblCellMar>
+          <w:top w:w="15" w:type="dxa"/>
+          <w:left w:w="15" w:type="dxa"/>
+          <w:bottom w:w="15" w:type="dxa"/>
+          <w:right w:w="15" w:type="dxa"/>
+        </w:tblCellMar>
+        <w:tblLook w:val="04A0" w:firstRow="1" w:lastRow="0" w:firstColumn="1" w:lastColumn="0" w:noHBand="0" w:noVBand="1"/>
+      </w:tblPr>
+      <w:tblGrid>
+        <w:gridCol w:w="480"/>
+        <w:gridCol w:w="1422"/>
+        <w:gridCol w:w="1851"/>
+        <w:gridCol w:w="1948"/>
+        <w:gridCol w:w="1661"/>
+        <w:gridCol w:w="1476"/>
+      </w:tblGrid>
+      <w:tr>
+        <w:trPr>
+          <w:tblHeader/>
+          <w:tblCellSpacing w:w="15" w:type="dxa"/>
+        </w:trPr>
+        <w:tc>
+          <w:tcPr>
+            <w:tcW w:w="0" w:type="auto"/>
+            <w:vAlign w:val="center"/>
+            <w:hideMark/>
+          </w:tcPr>
+          <w:p>
+            <w:pPr>
+              <w:rPr>
+                <w:b/>
+                <w:bCs/>
+              </w:rPr>
+            </w:pPr>
+            <w:r>
+              <w:rPr>
+                <w:b/>
+                <w:bCs/>
+              </w:rPr>
+              <w:t>ID</w:t>
+            </w:r>
+          </w:p>
+        </w:tc>
+        <w:tc>
+          <w:tcPr>
+            <w:tcW w:w="0" w:type="auto"/>
+            <w:vAlign w:val="center"/>
+            <w:hideMark/>
+          </w:tcPr>
+          <w:p>
+            <w:pPr>
+              <w:rPr>
+                <w:b/>
+                <w:bCs/>
+              </w:rPr>
+            </w:pPr>
+            <w:r>
+              <w:rPr>
+                <w:b/>
+                <w:bCs/>
+              </w:rPr>
+              <w:t>Se produce en el paso</w:t>
+            </w:r>
+          </w:p>
+        </w:tc>
+        <w:tc>
+          <w:tcPr>
+            <w:tcW w:w="0" w:type="auto"/>
+            <w:vAlign w:val="center"/>
+            <w:hideMark/>
+          </w:tcPr>
+          <w:p>
+            <w:pPr>
+              <w:rPr>
+                <w:b/>
+                <w:bCs/>
+              </w:rPr>
+            </w:pPr>
+            <w:r>
+              <w:rPr>
+                <w:b/>
+                <w:bCs/>
+              </w:rPr>
+              <w:t>Error</w:t>
+            </w:r>
+          </w:p>
+        </w:tc>
+        <w:tc>
+          <w:tcPr>
+            <w:tcW w:w="0" w:type="auto"/>
+            <w:vAlign w:val="center"/>
+            <w:hideMark/>
+          </w:tcPr>
+          <w:p>
+            <w:pPr>
+              <w:rPr>
+                <w:b/>
+                <w:bCs/>
+              </w:rPr>
+            </w:pPr>
+            <w:r>
+              <w:rPr>
+                <w:b/>
+                <w:bCs/>
+              </w:rPr>
+              <w:t>Manejo del sistema</w:t>
+            </w:r>
+          </w:p>
+        </w:tc>
+        <w:tc>
+          <w:tcPr>
+            <w:tcW w:w="0" w:type="auto"/>
+            <w:vAlign w:val="center"/>
+            <w:hideMark/>
+          </w:tcPr>
+          <w:p>
+            <w:pPr>
+              <w:rPr>
+                <w:b/>
+                <w:bCs/>
+              </w:rPr>
+            </w:pPr>
+            <w:r>
+              <w:rPr>
+                <w:b/>
+                <w:bCs/>
+              </w:rPr>
+              <w:t>Mensaje al usuario</w:t>
+            </w:r>
+          </w:p>
+        </w:tc>
+        <w:tc>
+          <w:tcPr>
+            <w:tcW w:w="0" w:type="auto"/>
+            <w:vAlign w:val="center"/>
+            <w:hideMark/>
+          </w:tcPr>
+          <w:p>
+            <w:pPr>
+              <w:rPr>
+                <w:b/>
+                <w:bCs/>
+              </w:rPr>
+            </w:pPr>
+            <w:r>
+              <w:rPr>
+                <w:b/>
+                <w:bCs/>
+              </w:rPr>
+              <w:t>Registro/Log</w:t>
+            </w:r>
+          </w:p>
+        </w:tc>
+      </w:tr>
+      <w:tr>
+        <w:trPr>
+          <w:tblCellSpacing w:w="15" w:type="dxa"/>
+        </w:trPr>
+        <w:tc>
+          <w:tcPr>
+            <w:tcW w:w="0" w:type="auto"/>
+            <w:vAlign w:val="center"/>
+            <w:hideMark/>
+          </w:tcPr>
+          <w:p>
+            <w:r>
+              <w:t>EX-01</w:t>
+            </w:r>
+          </w:p>
+        </w:tc>
+        <w:tc>
+          <w:tcPr>
+            <w:tcW w:w="0" w:type="auto"/>
+            <w:vAlign w:val="center"/>
+            <w:hideMark/>
+          </w:tcPr>
+          <w:p>
+            <w:r>
+              <w:t>3–4</w:t>
+            </w:r>
+          </w:p>
+        </w:tc>
+        <w:tc>
+          <w:tcPr>
+            <w:tcW w:w="0" w:type="auto"/>
+            <w:vAlign w:val="center"/>
+            <w:hideMark/>
+          </w:tcPr>
+          <w:p>
+            <w:r>
+              <w:t>BD/Auth no disponible</w:t>
+            </w:r>
+          </w:p>
+        </w:tc>
+        <w:tc>
+          <w:tcPr>
+            <w:tcW w:w="0" w:type="auto"/>
+            <w:vAlign w:val="center"/>
+            <w:hideMark/>
+          </w:tcPr>
+          <w:p>
+            <w:r>
+              <w:t>Responder 503; no autenticar</w:t>
+            </w:r>
+          </w:p>
+        </w:tc>
+        <w:tc>
+          <w:tcPr>
+            <w:tcW w:w="0" w:type="auto"/>
+            <w:vAlign w:val="center"/>
+            <w:hideMark/>
+          </w:tcPr>
+          <w:p>
+            <w:r>
+              <w:t>“Servicio no disponible”</w:t>
+            </w:r>
+          </w:p>
+        </w:tc>
+        <w:tc>
+          <w:tcPr>
+            <w:tcW w:w="0" w:type="auto"/>
+            <w:vAlign w:val="center"/>
+            <w:hideMark/>
+          </w:tcPr>
+          <w:p>
+            <w:r>
+              <w:t>Log error + trace</w:t>
+            </w:r>
+          </w:p>
+        </w:tc>
+      </w:tr>
+      <w:tr>
+        <w:trPr>
+          <w:tblCellSpacing w:w="15" w:type="dxa"/>
+        </w:trPr>
+        <w:tc>
+          <w:tcPr>
+            <w:tcW w:w="0" w:type="auto"/>
+            <w:vAlign w:val="center"/>
+            <w:hideMark/>
+          </w:tcPr>
+          <w:p>
+            <w:r>
+              <w:t>EX-02</w:t>
+            </w:r>
+          </w:p>
+        </w:tc>
+        <w:tc>
+          <w:tcPr>
+            <w:tcW w:w="0" w:type="auto"/>
+            <w:vAlign w:val="center"/>
+            <w:hideMark/>
+          </w:tcPr>
+          <w:p>
+            <w:r>
+              <w:t>5</w:t>
+            </w:r>
+          </w:p>
+        </w:tc>
+        <w:tc>
+          <w:tcPr>
+            <w:tcW w:w="0" w:type="auto"/>
+            <w:vAlign w:val="center"/>
+            <w:hideMark/>
+          </w:tcPr>
+          <w:p>
+            <w:r>
+              <w:t>Error al crear sesión/token</w:t>
+            </w:r>
+          </w:p>
+        </w:tc>
+        <w:tc>
+          <w:tcPr>
+            <w:tcW w:w="0" w:type="auto"/>
+            <w:vAlign w:val="center"/>
+            <w:hideMark/>
+          </w:tcPr>
+          <w:p>
+            <w:r>
+              <w:t>Reintentar 1 vez; si falla, abortar</w:t>
+            </w:r>
+          </w:p>
+        </w:tc>
+        <w:tc>
+          <w:tcPr>
+            <w:tcW w:w="0" w:type="auto"/>
+            <w:vAlign w:val="center"/>
+            <w:hideMark/>
+          </w:tcPr>
+          <w:p>
+            <w:r>
+              <w:t>“Intenta de nuevo”</w:t>
+            </w:r>
+          </w:p>
+        </w:tc>
+        <w:tc>
+          <w:tcPr>
+            <w:tcW w:w="0" w:type="auto"/>
+            <w:vAlign w:val="center"/>
+            <w:hideMark/>
+          </w:tcPr>
+          <w:p>
+            <w:r>
+              <w:t>Log + métrica</w:t>
+            </w:r>
+          </w:p>
+        </w:tc>
+      </w:tr>
+    </w:tbl>
+    <w:p>
+      <w:pPr>
+        <w:rPr>
+          <w:lang w:val="es-MX"/>
+        </w:rPr>
+      </w:pPr>
     </w:p>
     <w:sectPr>
       <w:pgSz w:w="12240" w:h="15840"/>
@@ -760,7 +2445,6 @@
   <w:style w:type="character" w:default="1" w:styleId="Fuentedeprrafopredeter">
     <w:name w:val="Default Paragraph Font"/>
     <w:uiPriority w:val="1"/>
-    <w:semiHidden/>
     <w:unhideWhenUsed/>
   </w:style>
   <w:style w:type="table" w:default="1" w:styleId="Tablanormal">

</xml_diff>

<commit_message>
Agregar diagrama con los principiales procesos del negocio (Casos de Uso)
</commit_message>
<xml_diff>
--- a/RequerimientosSistemasFacturacionLavautos.docx
+++ b/RequerimientosSistemasFacturacionLavautos.docx
@@ -801,7 +801,13 @@
     <w:sdt>
       <w:sdtPr>
         <w:rPr>
-          <w:lang w:val="es-ES"/>
+          <w:rFonts w:asciiTheme="minorHAnsi" w:eastAsiaTheme="minorHAnsi" w:hAnsiTheme="minorHAnsi" w:cstheme="minorBidi"/>
+          <w:color w:val="auto"/>
+          <w:kern w:val="2"/>
+          <w:sz w:val="24"/>
+          <w:szCs w:val="24"/>
+          <w:lang w:val="es-ES" w:eastAsia="en-US"/>
+          <w14:ligatures w14:val="standardContextual"/>
         </w:rPr>
         <w:id w:val="329192928"/>
         <w:docPartObj>
@@ -811,15 +817,8 @@
       </w:sdtPr>
       <w:sdtEndPr>
         <w:rPr>
-          <w:rFonts w:asciiTheme="minorHAnsi" w:eastAsiaTheme="minorHAnsi" w:hAnsiTheme="minorHAnsi" w:cstheme="minorBidi"/>
           <w:b/>
           <w:bCs/>
-          <w:color w:val="auto"/>
-          <w:kern w:val="2"/>
-          <w:sz w:val="24"/>
-          <w:szCs w:val="24"/>
-          <w:lang w:eastAsia="en-US"/>
-          <w14:ligatures w14:val="standardContextual"/>
         </w:rPr>
       </w:sdtEndPr>
       <w:sdtContent>
@@ -2179,6 +2178,60 @@
       </w:pPr>
       <w:r>
         <w:rPr>
+          <w:noProof/>
+          <w:lang w:val="es-MX"/>
+        </w:rPr>
+        <w:drawing>
+          <wp:inline distT="0" distB="0" distL="0" distR="0" wp14:anchorId="6ECE936D" wp14:editId="14314002">
+            <wp:extent cx="5612130" cy="5509895"/>
+            <wp:effectExtent l="0" t="0" r="7620" b="0"/>
+            <wp:docPr id="988461004" name="Imagen 2"/>
+            <wp:cNvGraphicFramePr>
+              <a:graphicFrameLocks xmlns:a="http://schemas.openxmlformats.org/drawingml/2006/main" noChangeAspect="1"/>
+            </wp:cNvGraphicFramePr>
+            <a:graphic xmlns:a="http://schemas.openxmlformats.org/drawingml/2006/main">
+              <a:graphicData uri="http://schemas.openxmlformats.org/drawingml/2006/picture">
+                <pic:pic xmlns:pic="http://schemas.openxmlformats.org/drawingml/2006/picture">
+                  <pic:nvPicPr>
+                    <pic:cNvPr id="988461004" name="Imagen 988461004"/>
+                    <pic:cNvPicPr/>
+                  </pic:nvPicPr>
+                  <pic:blipFill>
+                    <a:blip r:embed="rId8">
+                      <a:extLst>
+                        <a:ext uri="{28A0092B-C50C-407E-A947-70E740481C1C}">
+                          <a14:useLocalDpi xmlns:a14="http://schemas.microsoft.com/office/drawing/2010/main" val="0"/>
+                        </a:ext>
+                      </a:extLst>
+                    </a:blip>
+                    <a:stretch>
+                      <a:fillRect/>
+                    </a:stretch>
+                  </pic:blipFill>
+                  <pic:spPr>
+                    <a:xfrm>
+                      <a:off x="0" y="0"/>
+                      <a:ext cx="5612130" cy="5509895"/>
+                    </a:xfrm>
+                    <a:prstGeom prst="rect">
+                      <a:avLst/>
+                    </a:prstGeom>
+                  </pic:spPr>
+                </pic:pic>
+              </a:graphicData>
+            </a:graphic>
+          </wp:inline>
+        </w:drawing>
+      </w:r>
+    </w:p>
+    <w:p>
+      <w:pPr>
+        <w:rPr>
+          <w:lang w:val="es-MX"/>
+        </w:rPr>
+      </w:pPr>
+      <w:r>
+        <w:rPr>
           <w:lang w:val="es-MX"/>
         </w:rPr>
         <w:t xml:space="preserve">Se debe </w:t>
@@ -2203,6 +2256,30 @@
         </w:rPr>
         <w:t xml:space="preserve"> autos </w:t>
       </w:r>
+      <w:r>
+        <w:rPr>
+          <w:lang w:val="es-MX"/>
+        </w:rPr>
+        <w:t xml:space="preserve">… </w:t>
+      </w:r>
+      <w:r>
+        <w:rPr>
+          <w:b/>
+          <w:bCs/>
+          <w:lang w:val="es-MX"/>
+        </w:rPr>
+        <w:t xml:space="preserve">Continuar descripción del negocio </w:t>
+      </w:r>
+      <w:proofErr w:type="spellStart"/>
+      <w:r>
+        <w:rPr>
+          <w:b/>
+          <w:bCs/>
+          <w:lang w:val="es-MX"/>
+        </w:rPr>
+        <w:t>aqui</w:t>
+      </w:r>
+      <w:proofErr w:type="spellEnd"/>
     </w:p>
     <w:p>
       <w:pPr>
@@ -3677,15 +3754,6 @@
   </w:num>
   <w:num w:numId="2" w16cid:durableId="238098860">
     <w:abstractNumId w:val="1"/>
-    <w:lvlOverride w:ilvl="0"/>
-    <w:lvlOverride w:ilvl="1"/>
-    <w:lvlOverride w:ilvl="2"/>
-    <w:lvlOverride w:ilvl="3"/>
-    <w:lvlOverride w:ilvl="4"/>
-    <w:lvlOverride w:ilvl="5"/>
-    <w:lvlOverride w:ilvl="6"/>
-    <w:lvlOverride w:ilvl="7"/>
-    <w:lvlOverride w:ilvl="8"/>
   </w:num>
   <w:num w:numId="3" w16cid:durableId="1946033716">
     <w:abstractNumId w:val="2"/>
@@ -4305,6 +4373,7 @@
   <w:style w:type="character" w:default="1" w:styleId="Fuentedeprrafopredeter">
     <w:name w:val="Default Paragraph Font"/>
     <w:uiPriority w:val="1"/>
+    <w:semiHidden/>
     <w:unhideWhenUsed/>
   </w:style>
   <w:style w:type="table" w:default="1" w:styleId="Tablanormal">

</xml_diff>

<commit_message>
actualisasion de documento word
descripsion de proceso de facturacion y atencion
</commit_message>
<xml_diff>
--- a/RequerimientosSistemasFacturacionLavautos.docx
+++ b/RequerimientosSistemasFacturacionLavautos.docx
@@ -13,6 +13,7 @@
           <w:docPartUnique/>
         </w:docPartObj>
       </w:sdtPr>
+      <w:sdtEndPr/>
       <w:sdtContent>
         <w:p>
           <w:pPr>
@@ -181,6 +182,7 @@
                                         <w:dataBinding w:prefixMappings="xmlns:ns0='http://purl.org/dc/elements/1.1/' xmlns:ns1='http://schemas.openxmlformats.org/package/2006/metadata/core-properties' " w:xpath="/ns1:coreProperties[1]/ns0:title[1]" w:storeItemID="{6C3C8BC8-F283-45AE-878A-BAB7291924A1}"/>
                                         <w:text/>
                                       </w:sdtPr>
+                                      <w:sdtEndPr/>
                                       <w:sdtContent>
                                         <w:p>
                                           <w:pPr>
@@ -218,6 +220,7 @@
                                         <w:dataBinding w:prefixMappings="xmlns:ns0='http://purl.org/dc/elements/1.1/' xmlns:ns1='http://schemas.openxmlformats.org/package/2006/metadata/core-properties' " w:xpath="/ns1:coreProperties[1]/ns0:subject[1]" w:storeItemID="{6C3C8BC8-F283-45AE-878A-BAB7291924A1}"/>
                                         <w:text/>
                                       </w:sdtPr>
+                                      <w:sdtEndPr/>
                                       <w:sdtContent>
                                         <w:p>
                                           <w:pPr>
@@ -272,6 +275,7 @@
                                         <w:dataBinding w:prefixMappings="xmlns:ns0='http://schemas.microsoft.com/office/2006/coverPageProps' " w:xpath="/ns0:CoverPageProperties[1]/ns0:Abstract[1]" w:storeItemID="{55AF091B-3C7A-41E3-B477-F2FDAA23CFDA}"/>
                                         <w:text/>
                                       </w:sdtPr>
+                                      <w:sdtEndPr/>
                                       <w:sdtContent>
                                         <w:p>
                                           <w:pPr>
@@ -327,6 +331,7 @@
                                           <w:dataBinding w:prefixMappings="xmlns:ns0='http://purl.org/dc/elements/1.1/' xmlns:ns1='http://schemas.openxmlformats.org/package/2006/metadata/core-properties' " w:xpath="/ns1:coreProperties[1]/ns1:category[1]" w:storeItemID="{6C3C8BC8-F283-45AE-878A-BAB7291924A1}"/>
                                           <w:text/>
                                         </w:sdtPr>
+                                        <w:sdtEndPr/>
                                         <w:sdtContent>
                                           <w:r>
                                             <w:rPr>
@@ -526,6 +531,7 @@
                                   <w:dataBinding w:prefixMappings="xmlns:ns0='http://purl.org/dc/elements/1.1/' xmlns:ns1='http://schemas.openxmlformats.org/package/2006/metadata/core-properties' " w:xpath="/ns1:coreProperties[1]/ns0:title[1]" w:storeItemID="{6C3C8BC8-F283-45AE-878A-BAB7291924A1}"/>
                                   <w:text/>
                                 </w:sdtPr>
+                                <w:sdtEndPr/>
                                 <w:sdtContent>
                                   <w:p>
                                     <w:pPr>
@@ -563,6 +569,7 @@
                                   <w:dataBinding w:prefixMappings="xmlns:ns0='http://purl.org/dc/elements/1.1/' xmlns:ns1='http://schemas.openxmlformats.org/package/2006/metadata/core-properties' " w:xpath="/ns1:coreProperties[1]/ns0:subject[1]" w:storeItemID="{6C3C8BC8-F283-45AE-878A-BAB7291924A1}"/>
                                   <w:text/>
                                 </w:sdtPr>
+                                <w:sdtEndPr/>
                                 <w:sdtContent>
                                   <w:p>
                                     <w:pPr>
@@ -617,6 +624,7 @@
                                   <w:dataBinding w:prefixMappings="xmlns:ns0='http://schemas.microsoft.com/office/2006/coverPageProps' " w:xpath="/ns0:CoverPageProperties[1]/ns0:Abstract[1]" w:storeItemID="{55AF091B-3C7A-41E3-B477-F2FDAA23CFDA}"/>
                                   <w:text/>
                                 </w:sdtPr>
+                                <w:sdtEndPr/>
                                 <w:sdtContent>
                                   <w:p>
                                     <w:pPr>
@@ -672,6 +680,7 @@
                                     <w:dataBinding w:prefixMappings="xmlns:ns0='http://purl.org/dc/elements/1.1/' xmlns:ns1='http://schemas.openxmlformats.org/package/2006/metadata/core-properties' " w:xpath="/ns1:coreProperties[1]/ns1:category[1]" w:storeItemID="{6C3C8BC8-F283-45AE-878A-BAB7291924A1}"/>
                                     <w:text/>
                                   </w:sdtPr>
+                                  <w:sdtEndPr/>
                                   <w:sdtContent>
                                     <w:r>
                                       <w:rPr>
@@ -2227,6 +2236,8 @@
     <w:p>
       <w:pPr>
         <w:rPr>
+          <w:b/>
+          <w:bCs/>
           <w:lang w:val="es-MX"/>
         </w:rPr>
       </w:pPr>
@@ -2270,16 +2281,82 @@
         </w:rPr>
         <w:t xml:space="preserve">Continuar descripción del negocio </w:t>
       </w:r>
-      <w:proofErr w:type="spellStart"/>
       <w:r>
         <w:rPr>
           <w:b/>
           <w:bCs/>
           <w:lang w:val="es-MX"/>
         </w:rPr>
-        <w:t>aqui</w:t>
+        <w:t>aquí</w:t>
       </w:r>
-      <w:proofErr w:type="spellEnd"/>
+    </w:p>
+    <w:p>
+      <w:pPr>
+        <w:rPr>
+          <w:b/>
+          <w:bCs/>
+          <w:lang w:val="es-MX"/>
+        </w:rPr>
+      </w:pPr>
+    </w:p>
+    <w:p>
+      <w:pPr>
+        <w:rPr>
+          <w:b/>
+          <w:bCs/>
+          <w:lang w:val="es-MX"/>
+        </w:rPr>
+      </w:pPr>
+    </w:p>
+    <w:p>
+      <w:pPr>
+        <w:rPr>
+          <w:b/>
+          <w:bCs/>
+          <w:lang w:val="es-MX"/>
+        </w:rPr>
+      </w:pPr>
+    </w:p>
+    <w:p>
+      <w:r>
+        <w:lastRenderedPageBreak/>
+        <w:t xml:space="preserve">El señor José llegó al lavadero de autos con la intención de limpiar su carro. Al entrar fue atendido por Miguel, el encargado, quien le ofreció una lavada sencilla, además de limpieza por debajo del motor y de la cojinería. José aceptó el servicio y Miguel indicó a Fabián que se encargara del lavado. Luego le informó al cliente que el costo sería de </w:t>
+      </w:r>
+      <w:r>
+        <w:rPr>
+          <w:b/>
+          <w:bCs/>
+        </w:rPr>
+        <w:t>145</w:t>
+      </w:r>
+      <w:r>
+        <w:t xml:space="preserve"> y que debía regresar en un tiempo aproximado de </w:t>
+      </w:r>
+      <w:r>
+        <w:rPr>
+          <w:b/>
+          <w:bCs/>
+        </w:rPr>
+        <w:t>5 a 6 horas</w:t>
+      </w:r>
+      <w:r>
+        <w:t>.</w:t>
+      </w:r>
+    </w:p>
+    <w:p>
+      <w:r>
+        <w:t>Pasado ese tiempo, José volvió al lavadero. Miguel lo recibió y le mostró el carro ya terminado. El vehículo estaba limpio, con la pintura brillante, la cojinería fresca y el motor en buen estado. José revisó el trabajo, quedó satisfecho con el resultado y agradeció la atención. Después de cancelar el valor acordado, se despidió y salió del lugar contento con el servicio recibido</w:t>
+      </w:r>
+      <w:r>
+        <w:t xml:space="preserve"> con ganas de recomendar el lugar a toda su familia.</w:t>
+      </w:r>
+    </w:p>
+    <w:p>
+      <w:pPr>
+        <w:rPr>
+          <w:lang w:val="es-MX"/>
+        </w:rPr>
+      </w:pPr>
     </w:p>
     <w:p>
       <w:pPr>

</xml_diff>

<commit_message>
Actualizacion de documento de requerimientos, explicando procesos de negocio
</commit_message>
<xml_diff>
--- a/RequerimientosSistemasFacturacionLavautos.docx
+++ b/RequerimientosSistemasFacturacionLavautos.docx
@@ -771,7 +771,7 @@
           <w:lang w:val="es-MX"/>
         </w:rPr>
       </w:pPr>
-      <w:bookmarkStart w:id="0" w:name="_Toc223981110"/>
+      <w:bookmarkStart w:id="0" w:name="_Toc224582848"/>
       <w:r>
         <w:rPr>
           <w:lang w:val="es-MX"/>
@@ -854,7 +854,7 @@
           <w:r>
             <w:fldChar w:fldCharType="separate"/>
           </w:r>
-          <w:hyperlink w:anchor="_Toc223981110" w:history="1">
+          <w:hyperlink w:anchor="_Toc224582848" w:history="1">
             <w:r>
               <w:rPr>
                 <w:rStyle w:val="Hipervnculo"/>
@@ -882,7 +882,7 @@
                 <w:noProof/>
                 <w:webHidden/>
               </w:rPr>
-              <w:instrText xml:space="preserve"> PAGEREF _Toc223981110 \h </w:instrText>
+              <w:instrText xml:space="preserve"> PAGEREF _Toc224582848 \h </w:instrText>
             </w:r>
             <w:r>
               <w:rPr>
@@ -925,7 +925,7 @@
               <w:lang w:eastAsia="es-CO"/>
             </w:rPr>
           </w:pPr>
-          <w:hyperlink w:anchor="_Toc223981111" w:history="1">
+          <w:hyperlink w:anchor="_Toc224582849" w:history="1">
             <w:r>
               <w:rPr>
                 <w:rStyle w:val="Hipervnculo"/>
@@ -953,7 +953,7 @@
                 <w:noProof/>
                 <w:webHidden/>
               </w:rPr>
-              <w:instrText xml:space="preserve"> PAGEREF _Toc223981111 \h </w:instrText>
+              <w:instrText xml:space="preserve"> PAGEREF _Toc224582849 \h </w:instrText>
             </w:r>
             <w:r>
               <w:rPr>
@@ -996,7 +996,7 @@
               <w:lang w:eastAsia="es-CO"/>
             </w:rPr>
           </w:pPr>
-          <w:hyperlink w:anchor="_Toc223981112" w:history="1">
+          <w:hyperlink w:anchor="_Toc224582850" w:history="1">
             <w:r>
               <w:rPr>
                 <w:rStyle w:val="Hipervnculo"/>
@@ -1024,7 +1024,7 @@
                 <w:noProof/>
                 <w:webHidden/>
               </w:rPr>
-              <w:instrText xml:space="preserve"> PAGEREF _Toc223981112 \h </w:instrText>
+              <w:instrText xml:space="preserve"> PAGEREF _Toc224582850 \h </w:instrText>
             </w:r>
             <w:r>
               <w:rPr>
@@ -1067,14 +1067,14 @@
               <w:lang w:eastAsia="es-CO"/>
             </w:rPr>
           </w:pPr>
-          <w:hyperlink w:anchor="_Toc223981113" w:history="1">
+          <w:hyperlink w:anchor="_Toc224582851" w:history="1">
             <w:r>
               <w:rPr>
                 <w:rStyle w:val="Hipervnculo"/>
                 <w:noProof/>
                 <w:lang w:val="es-MX"/>
               </w:rPr>
-              <w:t>Descripción del proceso de negocio</w:t>
+              <w:t>Diagrama de Casos de Uso del negocio del lava autos</w:t>
             </w:r>
             <w:r>
               <w:rPr>
@@ -1095,7 +1095,7 @@
                 <w:noProof/>
                 <w:webHidden/>
               </w:rPr>
-              <w:instrText xml:space="preserve"> PAGEREF _Toc223981113 \h </w:instrText>
+              <w:instrText xml:space="preserve"> PAGEREF _Toc224582851 \h </w:instrText>
             </w:r>
             <w:r>
               <w:rPr>
@@ -1138,14 +1138,84 @@
               <w:lang w:eastAsia="es-CO"/>
             </w:rPr>
           </w:pPr>
-          <w:hyperlink w:anchor="_Toc223981114" w:history="1">
+          <w:hyperlink w:anchor="_Toc224582852" w:history="1">
+            <w:r>
+              <w:rPr>
+                <w:rStyle w:val="Hipervnculo"/>
+                <w:noProof/>
+              </w:rPr>
+              <w:t>Descripción de un proceso de negocio en el lavadero de autos.</w:t>
+            </w:r>
+            <w:r>
+              <w:rPr>
+                <w:noProof/>
+                <w:webHidden/>
+              </w:rPr>
+              <w:tab/>
+            </w:r>
+            <w:r>
+              <w:rPr>
+                <w:noProof/>
+                <w:webHidden/>
+              </w:rPr>
+              <w:fldChar w:fldCharType="begin"/>
+            </w:r>
+            <w:r>
+              <w:rPr>
+                <w:noProof/>
+                <w:webHidden/>
+              </w:rPr>
+              <w:instrText xml:space="preserve"> PAGEREF _Toc224582852 \h </w:instrText>
+            </w:r>
+            <w:r>
+              <w:rPr>
+                <w:noProof/>
+                <w:webHidden/>
+              </w:rPr>
+            </w:r>
+            <w:r>
+              <w:rPr>
+                <w:noProof/>
+                <w:webHidden/>
+              </w:rPr>
+              <w:fldChar w:fldCharType="separate"/>
+            </w:r>
+            <w:r>
+              <w:rPr>
+                <w:noProof/>
+                <w:webHidden/>
+              </w:rPr>
+              <w:t>5</w:t>
+            </w:r>
+            <w:r>
+              <w:rPr>
+                <w:noProof/>
+                <w:webHidden/>
+              </w:rPr>
+              <w:fldChar w:fldCharType="end"/>
+            </w:r>
+          </w:hyperlink>
+        </w:p>
+        <w:p>
+          <w:pPr>
+            <w:pStyle w:val="TDC2"/>
+            <w:tabs>
+              <w:tab w:val="right" w:leader="dot" w:pos="8828"/>
+            </w:tabs>
+            <w:rPr>
+              <w:rFonts w:eastAsiaTheme="minorEastAsia"/>
+              <w:noProof/>
+              <w:lang w:eastAsia="es-CO"/>
+            </w:rPr>
+          </w:pPr>
+          <w:hyperlink w:anchor="_Toc224582853" w:history="1">
             <w:r>
               <w:rPr>
                 <w:rStyle w:val="Hipervnculo"/>
                 <w:noProof/>
                 <w:lang w:val="es-MX"/>
               </w:rPr>
-              <w:t>Iniciar Sesión</w:t>
+              <w:t>Modelado del proceso de Negocio</w:t>
             </w:r>
             <w:r>
               <w:rPr>
@@ -1166,7 +1236,7 @@
                 <w:noProof/>
                 <w:webHidden/>
               </w:rPr>
-              <w:instrText xml:space="preserve"> PAGEREF _Toc223981114 \h </w:instrText>
+              <w:instrText xml:space="preserve"> PAGEREF _Toc224582853 \h </w:instrText>
             </w:r>
             <w:r>
               <w:rPr>
@@ -1187,6 +1257,289 @@
                 <w:webHidden/>
               </w:rPr>
               <w:t>5</w:t>
+            </w:r>
+            <w:r>
+              <w:rPr>
+                <w:noProof/>
+                <w:webHidden/>
+              </w:rPr>
+              <w:fldChar w:fldCharType="end"/>
+            </w:r>
+          </w:hyperlink>
+        </w:p>
+        <w:p>
+          <w:pPr>
+            <w:pStyle w:val="TDC2"/>
+            <w:tabs>
+              <w:tab w:val="right" w:leader="dot" w:pos="8828"/>
+            </w:tabs>
+            <w:rPr>
+              <w:rFonts w:eastAsiaTheme="minorEastAsia"/>
+              <w:noProof/>
+              <w:lang w:eastAsia="es-CO"/>
+            </w:rPr>
+          </w:pPr>
+          <w:hyperlink w:anchor="_Toc224582854" w:history="1">
+            <w:r>
+              <w:rPr>
+                <w:rStyle w:val="Hipervnculo"/>
+                <w:noProof/>
+                <w:lang w:val="es-MX"/>
+              </w:rPr>
+              <w:t>Iniciar Sesión</w:t>
+            </w:r>
+            <w:r>
+              <w:rPr>
+                <w:noProof/>
+                <w:webHidden/>
+              </w:rPr>
+              <w:tab/>
+            </w:r>
+            <w:r>
+              <w:rPr>
+                <w:noProof/>
+                <w:webHidden/>
+              </w:rPr>
+              <w:fldChar w:fldCharType="begin"/>
+            </w:r>
+            <w:r>
+              <w:rPr>
+                <w:noProof/>
+                <w:webHidden/>
+              </w:rPr>
+              <w:instrText xml:space="preserve"> PAGEREF _Toc224582854 \h </w:instrText>
+            </w:r>
+            <w:r>
+              <w:rPr>
+                <w:noProof/>
+                <w:webHidden/>
+              </w:rPr>
+            </w:r>
+            <w:r>
+              <w:rPr>
+                <w:noProof/>
+                <w:webHidden/>
+              </w:rPr>
+              <w:fldChar w:fldCharType="separate"/>
+            </w:r>
+            <w:r>
+              <w:rPr>
+                <w:noProof/>
+                <w:webHidden/>
+              </w:rPr>
+              <w:t>6</w:t>
+            </w:r>
+            <w:r>
+              <w:rPr>
+                <w:noProof/>
+                <w:webHidden/>
+              </w:rPr>
+              <w:fldChar w:fldCharType="end"/>
+            </w:r>
+          </w:hyperlink>
+        </w:p>
+        <w:p>
+          <w:pPr>
+            <w:pStyle w:val="TDC2"/>
+            <w:tabs>
+              <w:tab w:val="right" w:leader="dot" w:pos="8828"/>
+            </w:tabs>
+            <w:rPr>
+              <w:rFonts w:eastAsiaTheme="minorEastAsia"/>
+              <w:noProof/>
+              <w:lang w:eastAsia="es-CO"/>
+            </w:rPr>
+          </w:pPr>
+          <w:hyperlink w:anchor="_Toc224582855" w:history="1">
+            <w:r>
+              <w:rPr>
+                <w:rStyle w:val="Hipervnculo"/>
+                <w:noProof/>
+              </w:rPr>
+              <w:t>Facturar Lavado de automóvil</w:t>
+            </w:r>
+            <w:r>
+              <w:rPr>
+                <w:noProof/>
+                <w:webHidden/>
+              </w:rPr>
+              <w:tab/>
+            </w:r>
+            <w:r>
+              <w:rPr>
+                <w:noProof/>
+                <w:webHidden/>
+              </w:rPr>
+              <w:fldChar w:fldCharType="begin"/>
+            </w:r>
+            <w:r>
+              <w:rPr>
+                <w:noProof/>
+                <w:webHidden/>
+              </w:rPr>
+              <w:instrText xml:space="preserve"> PAGEREF _Toc224582855 \h </w:instrText>
+            </w:r>
+            <w:r>
+              <w:rPr>
+                <w:noProof/>
+                <w:webHidden/>
+              </w:rPr>
+            </w:r>
+            <w:r>
+              <w:rPr>
+                <w:noProof/>
+                <w:webHidden/>
+              </w:rPr>
+              <w:fldChar w:fldCharType="separate"/>
+            </w:r>
+            <w:r>
+              <w:rPr>
+                <w:noProof/>
+                <w:webHidden/>
+              </w:rPr>
+              <w:t>7</w:t>
+            </w:r>
+            <w:r>
+              <w:rPr>
+                <w:noProof/>
+                <w:webHidden/>
+              </w:rPr>
+              <w:fldChar w:fldCharType="end"/>
+            </w:r>
+          </w:hyperlink>
+        </w:p>
+        <w:p>
+          <w:pPr>
+            <w:pStyle w:val="TDC2"/>
+            <w:tabs>
+              <w:tab w:val="right" w:leader="dot" w:pos="8828"/>
+            </w:tabs>
+            <w:rPr>
+              <w:rFonts w:eastAsiaTheme="minorEastAsia"/>
+              <w:noProof/>
+              <w:lang w:eastAsia="es-CO"/>
+            </w:rPr>
+          </w:pPr>
+          <w:hyperlink w:anchor="_Toc224582856" w:history="1">
+            <w:r>
+              <w:rPr>
+                <w:rStyle w:val="Hipervnculo"/>
+                <w:noProof/>
+                <w:lang w:val="es-MX"/>
+              </w:rPr>
+              <w:t>Recibir automóvil para lavado</w:t>
+            </w:r>
+            <w:r>
+              <w:rPr>
+                <w:noProof/>
+                <w:webHidden/>
+              </w:rPr>
+              <w:tab/>
+            </w:r>
+            <w:r>
+              <w:rPr>
+                <w:noProof/>
+                <w:webHidden/>
+              </w:rPr>
+              <w:fldChar w:fldCharType="begin"/>
+            </w:r>
+            <w:r>
+              <w:rPr>
+                <w:noProof/>
+                <w:webHidden/>
+              </w:rPr>
+              <w:instrText xml:space="preserve"> PAGEREF _Toc224582856 \h </w:instrText>
+            </w:r>
+            <w:r>
+              <w:rPr>
+                <w:noProof/>
+                <w:webHidden/>
+              </w:rPr>
+            </w:r>
+            <w:r>
+              <w:rPr>
+                <w:noProof/>
+                <w:webHidden/>
+              </w:rPr>
+              <w:fldChar w:fldCharType="separate"/>
+            </w:r>
+            <w:r>
+              <w:rPr>
+                <w:noProof/>
+                <w:webHidden/>
+              </w:rPr>
+              <w:t>9</w:t>
+            </w:r>
+            <w:r>
+              <w:rPr>
+                <w:noProof/>
+                <w:webHidden/>
+              </w:rPr>
+              <w:fldChar w:fldCharType="end"/>
+            </w:r>
+          </w:hyperlink>
+        </w:p>
+        <w:p>
+          <w:pPr>
+            <w:pStyle w:val="TDC2"/>
+            <w:tabs>
+              <w:tab w:val="right" w:leader="dot" w:pos="8828"/>
+            </w:tabs>
+            <w:rPr>
+              <w:rFonts w:eastAsiaTheme="minorEastAsia"/>
+              <w:noProof/>
+              <w:lang w:eastAsia="es-CO"/>
+            </w:rPr>
+          </w:pPr>
+          <w:hyperlink w:anchor="_Toc224582857" w:history="1">
+            <w:r>
+              <w:rPr>
+                <w:rStyle w:val="Hipervnculo"/>
+                <w:noProof/>
+                <w:lang w:val="es-MX"/>
+              </w:rPr>
+              <w:t>Liquidar pago empleado</w:t>
+            </w:r>
+            <w:r>
+              <w:rPr>
+                <w:noProof/>
+                <w:webHidden/>
+              </w:rPr>
+              <w:tab/>
+            </w:r>
+            <w:r>
+              <w:rPr>
+                <w:noProof/>
+                <w:webHidden/>
+              </w:rPr>
+              <w:fldChar w:fldCharType="begin"/>
+            </w:r>
+            <w:r>
+              <w:rPr>
+                <w:noProof/>
+                <w:webHidden/>
+              </w:rPr>
+              <w:instrText xml:space="preserve"> PAGEREF _Toc224582857 \h </w:instrText>
+            </w:r>
+            <w:r>
+              <w:rPr>
+                <w:noProof/>
+                <w:webHidden/>
+              </w:rPr>
+            </w:r>
+            <w:r>
+              <w:rPr>
+                <w:noProof/>
+                <w:webHidden/>
+              </w:rPr>
+              <w:fldChar w:fldCharType="separate"/>
+            </w:r>
+            <w:r>
+              <w:rPr>
+                <w:noProof/>
+                <w:webHidden/>
+              </w:rPr>
+              <w:t>10</w:t>
             </w:r>
             <w:r>
               <w:rPr>
@@ -1244,7 +1597,7 @@
           <w:lang w:val="es-MX"/>
         </w:rPr>
       </w:pPr>
-      <w:bookmarkStart w:id="1" w:name="_Toc223981111"/>
+      <w:bookmarkStart w:id="1" w:name="_Toc224582849"/>
       <w:r>
         <w:rPr>
           <w:lang w:val="es-MX"/>
@@ -2114,7 +2467,7 @@
           <w:lang w:val="es-MX"/>
         </w:rPr>
       </w:pPr>
-      <w:bookmarkStart w:id="2" w:name="_Toc223981112"/>
+      <w:bookmarkStart w:id="2" w:name="_Toc224582850"/>
       <w:r>
         <w:rPr>
           <w:lang w:val="es-MX"/>
@@ -2161,12 +2514,24 @@
           <w:lang w:val="es-MX"/>
         </w:rPr>
       </w:pPr>
-      <w:bookmarkStart w:id="3" w:name="_Toc223981113"/>
+      <w:bookmarkStart w:id="3" w:name="_Toc224582851"/>
       <w:r>
         <w:rPr>
           <w:lang w:val="es-MX"/>
         </w:rPr>
-        <w:t>Descripción del proceso de negocio</w:t>
+        <w:t>Diagrama de Casos de Uso</w:t>
+      </w:r>
+      <w:r>
+        <w:rPr>
+          <w:lang w:val="es-MX"/>
+        </w:rPr>
+        <w:t xml:space="preserve"> del </w:t>
+      </w:r>
+      <w:r>
+        <w:rPr>
+          <w:lang w:val="es-MX"/>
+        </w:rPr>
+        <w:t>negocio del lava autos</w:t>
       </w:r>
       <w:bookmarkEnd w:id="3"/>
     </w:p>
@@ -2242,21 +2607,7 @@
         <w:rPr>
           <w:lang w:val="es-MX"/>
         </w:rPr>
-        <w:t xml:space="preserve">implementar un sistema de registro de facturación de servicios de </w:t>
-      </w:r>
-      <w:proofErr w:type="gramStart"/>
-      <w:r>
-        <w:rPr>
-          <w:lang w:val="es-MX"/>
-        </w:rPr>
-        <w:t>un lava</w:t>
-      </w:r>
-      <w:proofErr w:type="gramEnd"/>
-      <w:r>
-        <w:rPr>
-          <w:lang w:val="es-MX"/>
-        </w:rPr>
-        <w:t xml:space="preserve"> autos </w:t>
+        <w:t xml:space="preserve">implementar un sistema de registro de facturación de servicios de un lava autos </w:t>
       </w:r>
       <w:r>
         <w:rPr>
@@ -2309,8 +2660,18 @@
       </w:pPr>
     </w:p>
     <w:p>
+      <w:pPr>
+        <w:pStyle w:val="Ttulo2"/>
+      </w:pPr>
+      <w:bookmarkStart w:id="4" w:name="_Toc224582852"/>
       <w:r>
         <w:lastRenderedPageBreak/>
+        <w:t>Descripción de un proceso de negocio en el lavadero de autos.</w:t>
+      </w:r>
+      <w:bookmarkEnd w:id="4"/>
+    </w:p>
+    <w:p>
+      <w:r>
         <w:t xml:space="preserve">El señor José llegó al lavadero de autos con la intención de limpiar su carro. Al entrar fue atendido por Miguel, el encargado, quien le ofreció una lavada sencilla, además de limpieza por debajo del motor y de la cojinería. José aceptó el servicio y Miguel indicó a Fabián que se encargara del lavado. Luego le informó al cliente que el costo sería de </w:t>
       </w:r>
       <w:r>
@@ -2344,10 +2705,19 @@
     </w:p>
     <w:p>
       <w:pPr>
+        <w:pStyle w:val="Ttulo2"/>
         <w:rPr>
           <w:lang w:val="es-MX"/>
         </w:rPr>
       </w:pPr>
+      <w:bookmarkStart w:id="5" w:name="_Toc224582853"/>
+      <w:r>
+        <w:rPr>
+          <w:lang w:val="es-MX"/>
+        </w:rPr>
+        <w:t>Modelado del proceso de Negocio</w:t>
+      </w:r>
+      <w:bookmarkEnd w:id="5"/>
     </w:p>
     <w:p>
       <w:pPr>
@@ -2355,6 +2725,78 @@
           <w:lang w:val="es-MX"/>
         </w:rPr>
       </w:pPr>
+      <w:r>
+        <w:rPr>
+          <w:lang w:val="es-MX"/>
+        </w:rPr>
+        <w:t xml:space="preserve">(Ejemplo de modelado de negocio de un restaurante, hacer lo mismo para el lava autos basado </w:t>
+      </w:r>
+      <w:r>
+        <w:rPr>
+          <w:lang w:val="es-MX"/>
+        </w:rPr>
+        <w:t>https://miro.com/app/board/uXjVGw3jSgA=/?share_link_id=532958184690</w:t>
+      </w:r>
+      <w:r>
+        <w:rPr>
+          <w:lang w:val="es-MX"/>
+        </w:rPr>
+        <w:t>)</w:t>
+      </w:r>
+    </w:p>
+    <w:p>
+      <w:pPr>
+        <w:rPr>
+          <w:lang w:val="es-MX"/>
+        </w:rPr>
+      </w:pPr>
+      <w:r>
+        <w:rPr>
+          <w:noProof/>
+          <w:lang w:val="es-MX"/>
+        </w:rPr>
+        <w:drawing>
+          <wp:inline distT="0" distB="0" distL="0" distR="0" wp14:anchorId="08783C86" wp14:editId="7717D014">
+            <wp:extent cx="5612130" cy="1496060"/>
+            <wp:effectExtent l="0" t="0" r="7620" b="8890"/>
+            <wp:docPr id="1144883146" name="Imagen 3"/>
+            <wp:cNvGraphicFramePr>
+              <a:graphicFrameLocks xmlns:a="http://schemas.openxmlformats.org/drawingml/2006/main" noChangeAspect="1"/>
+            </wp:cNvGraphicFramePr>
+            <a:graphic xmlns:a="http://schemas.openxmlformats.org/drawingml/2006/main">
+              <a:graphicData uri="http://schemas.openxmlformats.org/drawingml/2006/picture">
+                <pic:pic xmlns:pic="http://schemas.openxmlformats.org/drawingml/2006/picture">
+                  <pic:nvPicPr>
+                    <pic:cNvPr id="1144883146" name="Imagen 1144883146"/>
+                    <pic:cNvPicPr/>
+                  </pic:nvPicPr>
+                  <pic:blipFill>
+                    <a:blip r:embed="rId9" cstate="print">
+                      <a:extLst>
+                        <a:ext uri="{28A0092B-C50C-407E-A947-70E740481C1C}">
+                          <a14:useLocalDpi xmlns:a14="http://schemas.microsoft.com/office/drawing/2010/main" val="0"/>
+                        </a:ext>
+                      </a:extLst>
+                    </a:blip>
+                    <a:stretch>
+                      <a:fillRect/>
+                    </a:stretch>
+                  </pic:blipFill>
+                  <pic:spPr>
+                    <a:xfrm>
+                      <a:off x="0" y="0"/>
+                      <a:ext cx="5612130" cy="1496060"/>
+                    </a:xfrm>
+                    <a:prstGeom prst="rect">
+                      <a:avLst/>
+                    </a:prstGeom>
+                  </pic:spPr>
+                </pic:pic>
+              </a:graphicData>
+            </a:graphic>
+          </wp:inline>
+        </w:drawing>
+      </w:r>
       <w:r>
         <w:rPr>
           <w:lang w:val="es-MX"/>
@@ -2369,7 +2811,7 @@
           <w:lang w:val="es-MX"/>
         </w:rPr>
       </w:pPr>
-      <w:bookmarkStart w:id="4" w:name="_Toc223981114"/>
+      <w:bookmarkStart w:id="6" w:name="_Toc224582854"/>
       <w:r>
         <w:rPr>
           <w:lang w:val="es-MX"/>
@@ -2377,7 +2819,7 @@
         <w:lastRenderedPageBreak/>
         <w:t>Iniciar Sesión</w:t>
       </w:r>
-      <w:bookmarkEnd w:id="4"/>
+      <w:bookmarkEnd w:id="6"/>
     </w:p>
     <w:tbl>
       <w:tblPr>
@@ -2840,13 +3282,6 @@
                 <w:lang w:val="es-419"/>
               </w:rPr>
             </w:pPr>
-            <w:r>
-              <w:rPr>
-                <w:b/>
-                <w:lang w:val="es-419"/>
-              </w:rPr>
-              <w:t>}</w:t>
-            </w:r>
           </w:p>
           <w:p>
             <w:pPr>
@@ -3300,12 +3735,2631 @@
     </w:p>
     <w:p>
       <w:pPr>
+        <w:pStyle w:val="Ttulo2"/>
+      </w:pPr>
+      <w:bookmarkStart w:id="7" w:name="_Toc224582855"/>
+      <w:r>
+        <w:lastRenderedPageBreak/>
+        <w:t>Facturar Lavado de automóvil</w:t>
+      </w:r>
+      <w:bookmarkEnd w:id="7"/>
+    </w:p>
+    <w:tbl>
+      <w:tblPr>
+        <w:tblW w:w="9930" w:type="dxa"/>
+        <w:tblBorders>
+          <w:top w:val="single" w:sz="4" w:space="0" w:color="000000"/>
+          <w:left w:val="single" w:sz="4" w:space="0" w:color="000000"/>
+          <w:bottom w:val="single" w:sz="4" w:space="0" w:color="000000"/>
+          <w:right w:val="single" w:sz="4" w:space="0" w:color="000000"/>
+          <w:insideH w:val="single" w:sz="4" w:space="0" w:color="000000"/>
+          <w:insideV w:val="single" w:sz="4" w:space="0" w:color="000000"/>
+        </w:tblBorders>
+        <w:tblLayout w:type="fixed"/>
+        <w:tblLook w:val="00A0" w:firstRow="1" w:lastRow="0" w:firstColumn="1" w:lastColumn="0" w:noHBand="0" w:noVBand="0"/>
+      </w:tblPr>
+      <w:tblGrid>
+        <w:gridCol w:w="2810"/>
+        <w:gridCol w:w="363"/>
+        <w:gridCol w:w="1621"/>
+        <w:gridCol w:w="168"/>
+        <w:gridCol w:w="1000"/>
+        <w:gridCol w:w="354"/>
+        <w:gridCol w:w="3614"/>
+      </w:tblGrid>
+      <w:tr>
+        <w:tc>
+          <w:tcPr>
+            <w:tcW w:w="2808" w:type="dxa"/>
+            <w:tcBorders>
+              <w:top w:val="single" w:sz="4" w:space="0" w:color="000000"/>
+              <w:left w:val="single" w:sz="4" w:space="0" w:color="000000"/>
+              <w:bottom w:val="single" w:sz="4" w:space="0" w:color="000000"/>
+              <w:right w:val="single" w:sz="4" w:space="0" w:color="000000"/>
+            </w:tcBorders>
+            <w:hideMark/>
+          </w:tcPr>
+          <w:p>
+            <w:pPr>
+              <w:rPr>
+                <w:b/>
+                <w:lang w:val="es-419"/>
+              </w:rPr>
+            </w:pPr>
+            <w:r>
+              <w:rPr>
+                <w:b/>
+                <w:lang w:val="es-419"/>
+              </w:rPr>
+              <w:t>Nombre de Requerimiento:</w:t>
+            </w:r>
+          </w:p>
+          <w:p>
+            <w:pPr>
+              <w:rPr>
+                <w:b/>
+                <w:lang w:val="es-419"/>
+              </w:rPr>
+            </w:pPr>
+            <w:r>
+              <w:rPr>
+                <w:b/>
+                <w:lang w:val="es-419"/>
+              </w:rPr>
+              <w:t>Facturar Lavado de Carro</w:t>
+            </w:r>
+          </w:p>
+          <w:p>
+            <w:pPr>
+              <w:rPr>
+                <w:lang w:val="es-419"/>
+              </w:rPr>
+            </w:pPr>
+          </w:p>
+        </w:tc>
+        <w:tc>
+          <w:tcPr>
+            <w:tcW w:w="3150" w:type="dxa"/>
+            <w:gridSpan w:val="4"/>
+            <w:tcBorders>
+              <w:top w:val="single" w:sz="4" w:space="0" w:color="000000"/>
+              <w:left w:val="single" w:sz="4" w:space="0" w:color="000000"/>
+              <w:bottom w:val="single" w:sz="4" w:space="0" w:color="000000"/>
+              <w:right w:val="single" w:sz="4" w:space="0" w:color="000000"/>
+            </w:tcBorders>
+            <w:hideMark/>
+          </w:tcPr>
+          <w:p>
+            <w:pPr>
+              <w:rPr>
+                <w:b/>
+                <w:lang w:val="es-419"/>
+              </w:rPr>
+            </w:pPr>
+            <w:r>
+              <w:rPr>
+                <w:b/>
+                <w:lang w:val="es-419"/>
+              </w:rPr>
+              <w:t>Encargado</w:t>
+            </w:r>
+            <w:r>
+              <w:rPr>
+                <w:b/>
+                <w:lang w:val="es-419"/>
+              </w:rPr>
+              <w:t>:</w:t>
+            </w:r>
+          </w:p>
+          <w:p>
+            <w:pPr>
+              <w:rPr>
+                <w:bCs/>
+                <w:lang w:val="es-419"/>
+              </w:rPr>
+            </w:pPr>
+          </w:p>
+        </w:tc>
+        <w:tc>
+          <w:tcPr>
+            <w:tcW w:w="3965" w:type="dxa"/>
+            <w:gridSpan w:val="2"/>
+            <w:tcBorders>
+              <w:top w:val="single" w:sz="4" w:space="0" w:color="000000"/>
+              <w:left w:val="single" w:sz="4" w:space="0" w:color="000000"/>
+              <w:bottom w:val="single" w:sz="4" w:space="0" w:color="000000"/>
+              <w:right w:val="single" w:sz="4" w:space="0" w:color="000000"/>
+            </w:tcBorders>
+            <w:hideMark/>
+          </w:tcPr>
+          <w:p>
+            <w:pPr>
+              <w:rPr>
+                <w:lang w:val="es-419"/>
+              </w:rPr>
+            </w:pPr>
+            <w:r>
+              <w:rPr>
+                <w:b/>
+                <w:lang w:val="es-419"/>
+              </w:rPr>
+              <w:t>Cliente</w:t>
+            </w:r>
+            <w:r>
+              <w:rPr>
+                <w:b/>
+                <w:lang w:val="es-419"/>
+              </w:rPr>
+              <w:t>:</w:t>
+            </w:r>
+          </w:p>
+          <w:p>
+            <w:pPr>
+              <w:rPr>
+                <w:lang w:val="es-419"/>
+              </w:rPr>
+            </w:pPr>
+          </w:p>
+        </w:tc>
+      </w:tr>
+      <w:tr>
+        <w:trPr>
+          <w:trHeight w:val="1484"/>
+        </w:trPr>
+        <w:tc>
+          <w:tcPr>
+            <w:tcW w:w="9923" w:type="dxa"/>
+            <w:gridSpan w:val="7"/>
+            <w:tcBorders>
+              <w:top w:val="single" w:sz="4" w:space="0" w:color="000000"/>
+              <w:left w:val="single" w:sz="4" w:space="0" w:color="000000"/>
+              <w:bottom w:val="single" w:sz="4" w:space="0" w:color="000000"/>
+              <w:right w:val="single" w:sz="4" w:space="0" w:color="000000"/>
+            </w:tcBorders>
+            <w:hideMark/>
+          </w:tcPr>
+          <w:p>
+            <w:pPr>
+              <w:rPr>
+                <w:b/>
+                <w:lang w:val="es-419"/>
+              </w:rPr>
+            </w:pPr>
+            <w:r>
+              <w:rPr>
+                <w:b/>
+                <w:lang w:val="es-419"/>
+              </w:rPr>
+              <w:t>Descripción del requerimiento</w:t>
+            </w:r>
+            <w:r>
+              <w:rPr>
+                <w:b/>
+                <w:lang w:val="es-419"/>
+              </w:rPr>
+              <w:t>:</w:t>
+            </w:r>
+          </w:p>
+          <w:p>
+            <w:pPr>
+              <w:rPr>
+                <w:b/>
+                <w:lang w:val="es-419"/>
+              </w:rPr>
+            </w:pPr>
+            <w:r>
+              <w:rPr>
+                <w:b/>
+                <w:lang w:val="es-419"/>
+              </w:rPr>
+              <w:t>Al finalizar el proceso de lavado en planta, se hace un llamado (</w:t>
+            </w:r>
+            <w:proofErr w:type="spellStart"/>
+            <w:r>
+              <w:rPr>
+                <w:b/>
+                <w:lang w:val="es-419"/>
+              </w:rPr>
+              <w:t>Via</w:t>
+            </w:r>
+            <w:proofErr w:type="spellEnd"/>
+            <w:r>
+              <w:rPr>
+                <w:b/>
+                <w:lang w:val="es-419"/>
+              </w:rPr>
+              <w:t xml:space="preserve"> ticket, </w:t>
+            </w:r>
+            <w:proofErr w:type="spellStart"/>
+            <w:r>
+              <w:rPr>
+                <w:b/>
+                <w:lang w:val="es-419"/>
+              </w:rPr>
+              <w:t>via</w:t>
+            </w:r>
+            <w:proofErr w:type="spellEnd"/>
+            <w:r>
+              <w:rPr>
+                <w:b/>
+                <w:lang w:val="es-419"/>
+              </w:rPr>
+              <w:t xml:space="preserve"> mensaje de </w:t>
+            </w:r>
+            <w:proofErr w:type="spellStart"/>
+            <w:r>
+              <w:rPr>
+                <w:b/>
+                <w:lang w:val="es-419"/>
+              </w:rPr>
+              <w:t>Whastapp</w:t>
+            </w:r>
+            <w:proofErr w:type="spellEnd"/>
+            <w:r>
+              <w:rPr>
+                <w:b/>
+                <w:lang w:val="es-419"/>
+              </w:rPr>
+              <w:t xml:space="preserve">), al cliente con el fin de llevar a cabo la entrega del </w:t>
+            </w:r>
+            <w:proofErr w:type="spellStart"/>
+            <w:r>
+              <w:rPr>
+                <w:b/>
+                <w:lang w:val="es-419"/>
+              </w:rPr>
+              <w:t>vehiculo</w:t>
+            </w:r>
+            <w:proofErr w:type="spellEnd"/>
+            <w:r>
+              <w:rPr>
+                <w:b/>
+                <w:lang w:val="es-419"/>
+              </w:rPr>
+              <w:t xml:space="preserve"> y realizar el pago.</w:t>
+            </w:r>
+          </w:p>
+          <w:p>
+            <w:pPr>
+              <w:rPr>
+                <w:lang w:val="es-419"/>
+              </w:rPr>
+            </w:pPr>
+          </w:p>
+        </w:tc>
+      </w:tr>
+      <w:tr>
+        <w:trPr>
+          <w:trHeight w:val="2240"/>
+        </w:trPr>
+        <w:tc>
+          <w:tcPr>
+            <w:tcW w:w="4959" w:type="dxa"/>
+            <w:gridSpan w:val="4"/>
+            <w:tcBorders>
+              <w:top w:val="single" w:sz="4" w:space="0" w:color="000000"/>
+              <w:left w:val="single" w:sz="4" w:space="0" w:color="000000"/>
+              <w:bottom w:val="single" w:sz="4" w:space="0" w:color="000000"/>
+              <w:right w:val="single" w:sz="4" w:space="0" w:color="000000"/>
+            </w:tcBorders>
+            <w:hideMark/>
+          </w:tcPr>
+          <w:p>
+            <w:pPr>
+              <w:rPr>
+                <w:b/>
+                <w:lang w:val="es-419"/>
+              </w:rPr>
+            </w:pPr>
+            <w:r>
+              <w:rPr>
+                <w:b/>
+                <w:lang w:val="es-419"/>
+              </w:rPr>
+              <w:t>Salida Esperada:</w:t>
+            </w:r>
+          </w:p>
+          <w:p>
+            <w:pPr>
+              <w:rPr>
+                <w:b/>
+                <w:lang w:val="es-419"/>
+              </w:rPr>
+            </w:pPr>
+            <w:r>
+              <w:rPr>
+                <w:b/>
+                <w:lang w:val="es-419"/>
+              </w:rPr>
+              <w:t>Cliente recibe factura, después de realizar el pago.</w:t>
+            </w:r>
+          </w:p>
+          <w:p>
+            <w:pPr>
+              <w:rPr>
+                <w:lang w:val="es-419"/>
+              </w:rPr>
+            </w:pPr>
+          </w:p>
+        </w:tc>
+        <w:tc>
+          <w:tcPr>
+            <w:tcW w:w="4964" w:type="dxa"/>
+            <w:gridSpan w:val="3"/>
+            <w:tcBorders>
+              <w:top w:val="single" w:sz="4" w:space="0" w:color="000000"/>
+              <w:left w:val="single" w:sz="4" w:space="0" w:color="000000"/>
+              <w:bottom w:val="single" w:sz="4" w:space="0" w:color="000000"/>
+              <w:right w:val="single" w:sz="4" w:space="0" w:color="000000"/>
+            </w:tcBorders>
+            <w:hideMark/>
+          </w:tcPr>
+          <w:p>
+            <w:pPr>
+              <w:rPr>
+                <w:b/>
+                <w:lang w:val="es-419"/>
+              </w:rPr>
+            </w:pPr>
+            <w:r>
+              <w:rPr>
+                <w:b/>
+                <w:lang w:val="es-419"/>
+              </w:rPr>
+              <w:t>Indicadores de la salida</w:t>
+            </w:r>
+            <w:r>
+              <w:rPr>
+                <w:b/>
+                <w:lang w:val="es-419"/>
+              </w:rPr>
+              <w:t>:</w:t>
+            </w:r>
+          </w:p>
+          <w:p>
+            <w:pPr>
+              <w:rPr>
+                <w:lang w:val="es-419"/>
+              </w:rPr>
+            </w:pPr>
+          </w:p>
+        </w:tc>
+      </w:tr>
+      <w:tr>
+        <w:trPr>
+          <w:trHeight w:val="1637"/>
+        </w:trPr>
+        <w:tc>
+          <w:tcPr>
+            <w:tcW w:w="3171" w:type="dxa"/>
+            <w:gridSpan w:val="2"/>
+            <w:tcBorders>
+              <w:top w:val="single" w:sz="4" w:space="0" w:color="000000"/>
+              <w:left w:val="single" w:sz="4" w:space="0" w:color="000000"/>
+              <w:bottom w:val="single" w:sz="4" w:space="0" w:color="000000"/>
+              <w:right w:val="single" w:sz="4" w:space="0" w:color="000000"/>
+            </w:tcBorders>
+            <w:hideMark/>
+          </w:tcPr>
+          <w:p>
+            <w:pPr>
+              <w:rPr>
+                <w:b/>
+                <w:lang w:val="es-419"/>
+              </w:rPr>
+            </w:pPr>
+            <w:r>
+              <w:rPr>
+                <w:b/>
+                <w:lang w:val="es-419"/>
+              </w:rPr>
+              <w:t>Dentro del alcance:</w:t>
+            </w:r>
+          </w:p>
+          <w:p>
+            <w:pPr>
+              <w:numPr>
+                <w:ilvl w:val="0"/>
+                <w:numId w:val="2"/>
+              </w:numPr>
+              <w:rPr>
+                <w:b/>
+                <w:lang w:val="es-419"/>
+              </w:rPr>
+            </w:pPr>
+            <w:r>
+              <w:rPr>
+                <w:b/>
+                <w:lang w:val="es-419"/>
+              </w:rPr>
+              <w:t xml:space="preserve">El cliente puede elegir el medio de pago: Efectivo, Transferencia de </w:t>
+            </w:r>
+            <w:proofErr w:type="spellStart"/>
+            <w:r>
+              <w:rPr>
+                <w:b/>
+                <w:lang w:val="es-419"/>
+              </w:rPr>
+              <w:t>nequi</w:t>
+            </w:r>
+            <w:proofErr w:type="spellEnd"/>
+            <w:r>
+              <w:rPr>
+                <w:b/>
+                <w:lang w:val="es-419"/>
+              </w:rPr>
+              <w:t>, o pago con tarjeta (</w:t>
+            </w:r>
+            <w:proofErr w:type="spellStart"/>
+            <w:r>
+              <w:rPr>
+                <w:b/>
+                <w:lang w:val="es-419"/>
+              </w:rPr>
+              <w:t>Credito</w:t>
+            </w:r>
+            <w:proofErr w:type="spellEnd"/>
+            <w:r>
+              <w:rPr>
+                <w:b/>
+                <w:lang w:val="es-419"/>
+              </w:rPr>
+              <w:t xml:space="preserve"> o </w:t>
+            </w:r>
+            <w:proofErr w:type="spellStart"/>
+            <w:r>
+              <w:rPr>
+                <w:b/>
+                <w:lang w:val="es-419"/>
+              </w:rPr>
+              <w:t>debito</w:t>
+            </w:r>
+            <w:proofErr w:type="spellEnd"/>
+            <w:r>
+              <w:rPr>
+                <w:b/>
+                <w:lang w:val="es-419"/>
+              </w:rPr>
+              <w:t>)</w:t>
+            </w:r>
+          </w:p>
+          <w:p>
+            <w:pPr>
+              <w:numPr>
+                <w:ilvl w:val="0"/>
+                <w:numId w:val="2"/>
+              </w:numPr>
+              <w:rPr>
+                <w:b/>
+                <w:lang w:val="es-419"/>
+              </w:rPr>
+            </w:pPr>
+          </w:p>
+          <w:p>
+            <w:pPr>
+              <w:numPr>
+                <w:ilvl w:val="0"/>
+                <w:numId w:val="2"/>
+              </w:numPr>
+              <w:rPr>
+                <w:b/>
+                <w:lang w:val="es-419"/>
+              </w:rPr>
+            </w:pPr>
+            <w:r>
+              <w:rPr>
+                <w:b/>
+                <w:lang w:val="es-419"/>
+              </w:rPr>
+              <w:t xml:space="preserve">  </w:t>
+            </w:r>
+          </w:p>
+          <w:p>
+            <w:pPr>
+              <w:numPr>
+                <w:ilvl w:val="0"/>
+                <w:numId w:val="2"/>
+              </w:numPr>
+              <w:rPr>
+                <w:b/>
+                <w:lang w:val="es-419"/>
+              </w:rPr>
+            </w:pPr>
+            <w:r>
+              <w:rPr>
+                <w:b/>
+                <w:lang w:val="es-419"/>
+              </w:rPr>
+              <w:t>…</w:t>
+            </w:r>
+          </w:p>
+          <w:p>
+            <w:pPr>
+              <w:numPr>
+                <w:ilvl w:val="0"/>
+                <w:numId w:val="2"/>
+              </w:numPr>
+              <w:rPr>
+                <w:b/>
+                <w:lang w:val="es-419"/>
+              </w:rPr>
+            </w:pPr>
+            <w:r>
+              <w:rPr>
+                <w:b/>
+                <w:lang w:val="es-419"/>
+              </w:rPr>
+              <w:t>…</w:t>
+            </w:r>
+          </w:p>
+        </w:tc>
+        <w:tc>
+          <w:tcPr>
+            <w:tcW w:w="3141" w:type="dxa"/>
+            <w:gridSpan w:val="4"/>
+            <w:tcBorders>
+              <w:top w:val="single" w:sz="4" w:space="0" w:color="000000"/>
+              <w:left w:val="single" w:sz="4" w:space="0" w:color="000000"/>
+              <w:bottom w:val="single" w:sz="4" w:space="0" w:color="000000"/>
+              <w:right w:val="single" w:sz="4" w:space="0" w:color="000000"/>
+            </w:tcBorders>
+            <w:hideMark/>
+          </w:tcPr>
+          <w:p>
+            <w:pPr>
+              <w:rPr>
+                <w:b/>
+                <w:lang w:val="es-419"/>
+              </w:rPr>
+            </w:pPr>
+            <w:r>
+              <w:rPr>
+                <w:b/>
+                <w:lang w:val="es-419"/>
+              </w:rPr>
+              <w:t>Fuera de alcance:</w:t>
+            </w:r>
+          </w:p>
+          <w:p>
+            <w:pPr>
+              <w:numPr>
+                <w:ilvl w:val="0"/>
+                <w:numId w:val="2"/>
+              </w:numPr>
+              <w:rPr>
+                <w:b/>
+                <w:lang w:val="es-419"/>
+              </w:rPr>
+            </w:pPr>
+            <w:r>
+              <w:rPr>
+                <w:b/>
+                <w:lang w:val="es-419"/>
+              </w:rPr>
+              <w:t>…</w:t>
+            </w:r>
+          </w:p>
+          <w:p>
+            <w:pPr>
+              <w:numPr>
+                <w:ilvl w:val="0"/>
+                <w:numId w:val="2"/>
+              </w:numPr>
+              <w:rPr>
+                <w:b/>
+                <w:lang w:val="es-419"/>
+              </w:rPr>
+            </w:pPr>
+            <w:r>
+              <w:rPr>
+                <w:b/>
+                <w:lang w:val="es-419"/>
+              </w:rPr>
+              <w:t>…</w:t>
+            </w:r>
+          </w:p>
+          <w:p>
+            <w:pPr>
+              <w:numPr>
+                <w:ilvl w:val="0"/>
+                <w:numId w:val="2"/>
+              </w:numPr>
+              <w:rPr>
+                <w:b/>
+                <w:lang w:val="es-419"/>
+              </w:rPr>
+            </w:pPr>
+            <w:r>
+              <w:rPr>
+                <w:b/>
+                <w:lang w:val="es-419"/>
+              </w:rPr>
+              <w:t>…</w:t>
+            </w:r>
+          </w:p>
+        </w:tc>
+        <w:tc>
+          <w:tcPr>
+            <w:tcW w:w="3611" w:type="dxa"/>
+            <w:tcBorders>
+              <w:top w:val="single" w:sz="4" w:space="0" w:color="000000"/>
+              <w:left w:val="single" w:sz="4" w:space="0" w:color="000000"/>
+              <w:bottom w:val="single" w:sz="4" w:space="0" w:color="000000"/>
+              <w:right w:val="single" w:sz="4" w:space="0" w:color="000000"/>
+            </w:tcBorders>
+          </w:tcPr>
+          <w:p>
+            <w:pPr>
+              <w:rPr>
+                <w:b/>
+                <w:lang w:val="es-419"/>
+              </w:rPr>
+            </w:pPr>
+            <w:r>
+              <w:rPr>
+                <w:b/>
+                <w:lang w:val="es-419"/>
+              </w:rPr>
+              <w:t>Requisitos no Funcionales</w:t>
+            </w:r>
+            <w:r>
+              <w:rPr>
+                <w:b/>
+                <w:lang w:val="es-419"/>
+              </w:rPr>
+              <w:t>:</w:t>
+            </w:r>
+          </w:p>
+          <w:p>
+            <w:pPr>
+              <w:numPr>
+                <w:ilvl w:val="0"/>
+                <w:numId w:val="2"/>
+              </w:numPr>
+              <w:rPr>
+                <w:b/>
+                <w:lang w:val="es-419"/>
+              </w:rPr>
+            </w:pPr>
+            <w:r>
+              <w:rPr>
+                <w:b/>
+                <w:lang w:val="es-419"/>
+              </w:rPr>
+              <w:t>…</w:t>
+            </w:r>
+          </w:p>
+          <w:p>
+            <w:pPr>
+              <w:numPr>
+                <w:ilvl w:val="0"/>
+                <w:numId w:val="2"/>
+              </w:numPr>
+              <w:rPr>
+                <w:b/>
+                <w:lang w:val="es-419"/>
+              </w:rPr>
+            </w:pPr>
+            <w:r>
+              <w:rPr>
+                <w:b/>
+                <w:lang w:val="es-419"/>
+              </w:rPr>
+              <w:t>…</w:t>
+            </w:r>
+          </w:p>
+          <w:p>
+            <w:pPr>
+              <w:numPr>
+                <w:ilvl w:val="0"/>
+                <w:numId w:val="2"/>
+              </w:numPr>
+              <w:rPr>
+                <w:b/>
+                <w:lang w:val="es-419"/>
+              </w:rPr>
+            </w:pPr>
+            <w:r>
+              <w:rPr>
+                <w:b/>
+                <w:lang w:val="es-419"/>
+              </w:rPr>
+              <w:t>…</w:t>
+            </w:r>
+          </w:p>
+          <w:p>
+            <w:pPr>
+              <w:rPr>
+                <w:b/>
+                <w:lang w:val="es-419"/>
+              </w:rPr>
+            </w:pPr>
+          </w:p>
+        </w:tc>
+      </w:tr>
+      <w:tr>
+        <w:trPr>
+          <w:trHeight w:val="1637"/>
+        </w:trPr>
+        <w:tc>
+          <w:tcPr>
+            <w:tcW w:w="4791" w:type="dxa"/>
+            <w:gridSpan w:val="3"/>
+            <w:tcBorders>
+              <w:top w:val="single" w:sz="4" w:space="0" w:color="000000"/>
+              <w:left w:val="single" w:sz="4" w:space="0" w:color="000000"/>
+              <w:bottom w:val="single" w:sz="4" w:space="0" w:color="000000"/>
+              <w:right w:val="single" w:sz="4" w:space="0" w:color="000000"/>
+            </w:tcBorders>
+          </w:tcPr>
+          <w:p>
+            <w:pPr>
+              <w:rPr>
+                <w:b/>
+                <w:lang w:val="es-419"/>
+              </w:rPr>
+            </w:pPr>
+            <w:r>
+              <w:rPr>
+                <w:b/>
+                <w:lang w:val="es-419"/>
+              </w:rPr>
+              <w:t>Producto mínimo viable</w:t>
+            </w:r>
+          </w:p>
+          <w:p>
+            <w:pPr>
+              <w:numPr>
+                <w:ilvl w:val="0"/>
+                <w:numId w:val="2"/>
+              </w:numPr>
+              <w:rPr>
+                <w:lang w:val="es-419"/>
+              </w:rPr>
+            </w:pPr>
+            <w:r>
+              <w:rPr>
+                <w:lang w:val="es-419"/>
+              </w:rPr>
+              <w:t>…</w:t>
+            </w:r>
+          </w:p>
+          <w:p>
+            <w:pPr>
+              <w:numPr>
+                <w:ilvl w:val="0"/>
+                <w:numId w:val="2"/>
+              </w:numPr>
+              <w:rPr>
+                <w:b/>
+                <w:lang w:val="es-419"/>
+              </w:rPr>
+            </w:pPr>
+            <w:r>
+              <w:rPr>
+                <w:b/>
+                <w:lang w:val="es-419"/>
+              </w:rPr>
+              <w:t>…</w:t>
+            </w:r>
+          </w:p>
+          <w:p>
+            <w:pPr>
+              <w:numPr>
+                <w:ilvl w:val="0"/>
+                <w:numId w:val="2"/>
+              </w:numPr>
+              <w:rPr>
+                <w:b/>
+                <w:lang w:val="es-419"/>
+              </w:rPr>
+            </w:pPr>
+            <w:r>
+              <w:rPr>
+                <w:b/>
+                <w:lang w:val="es-419"/>
+              </w:rPr>
+              <w:t>…</w:t>
+            </w:r>
+          </w:p>
+          <w:p>
+            <w:pPr>
+              <w:rPr>
+                <w:b/>
+                <w:lang w:val="es-419"/>
+              </w:rPr>
+            </w:pPr>
+          </w:p>
+        </w:tc>
+        <w:tc>
+          <w:tcPr>
+            <w:tcW w:w="5132" w:type="dxa"/>
+            <w:gridSpan w:val="4"/>
+            <w:tcBorders>
+              <w:top w:val="single" w:sz="4" w:space="0" w:color="000000"/>
+              <w:left w:val="single" w:sz="4" w:space="0" w:color="000000"/>
+              <w:bottom w:val="single" w:sz="4" w:space="0" w:color="000000"/>
+              <w:right w:val="single" w:sz="4" w:space="0" w:color="000000"/>
+            </w:tcBorders>
+          </w:tcPr>
+          <w:p>
+            <w:pPr>
+              <w:rPr>
+                <w:b/>
+                <w:lang w:val="es-419"/>
+              </w:rPr>
+            </w:pPr>
+            <w:r>
+              <w:rPr>
+                <w:b/>
+                <w:lang w:val="es-419"/>
+              </w:rPr>
+              <w:t xml:space="preserve"> </w:t>
+            </w:r>
+            <w:r>
+              <w:rPr>
+                <w:b/>
+                <w:lang w:val="es-419"/>
+              </w:rPr>
+              <w:t>(Opcional) Características Opcionales</w:t>
+            </w:r>
+          </w:p>
+          <w:p>
+            <w:pPr>
+              <w:numPr>
+                <w:ilvl w:val="0"/>
+                <w:numId w:val="2"/>
+              </w:numPr>
+              <w:rPr>
+                <w:lang w:val="es-419"/>
+              </w:rPr>
+            </w:pPr>
+            <w:r>
+              <w:rPr>
+                <w:lang w:val="es-419"/>
+              </w:rPr>
+              <w:t>…</w:t>
+            </w:r>
+          </w:p>
+          <w:p>
+            <w:pPr>
+              <w:numPr>
+                <w:ilvl w:val="0"/>
+                <w:numId w:val="2"/>
+              </w:numPr>
+              <w:rPr>
+                <w:b/>
+                <w:lang w:val="es-419"/>
+              </w:rPr>
+            </w:pPr>
+            <w:r>
+              <w:rPr>
+                <w:b/>
+                <w:lang w:val="es-419"/>
+              </w:rPr>
+              <w:t>…</w:t>
+            </w:r>
+          </w:p>
+          <w:p>
+            <w:pPr>
+              <w:numPr>
+                <w:ilvl w:val="0"/>
+                <w:numId w:val="2"/>
+              </w:numPr>
+              <w:rPr>
+                <w:b/>
+                <w:lang w:val="es-419"/>
+              </w:rPr>
+            </w:pPr>
+            <w:r>
+              <w:rPr>
+                <w:b/>
+                <w:lang w:val="es-419"/>
+              </w:rPr>
+              <w:t>…</w:t>
+            </w:r>
+          </w:p>
+          <w:p>
+            <w:pPr>
+              <w:rPr>
+                <w:b/>
+                <w:lang w:val="es-419"/>
+              </w:rPr>
+            </w:pPr>
+          </w:p>
+        </w:tc>
+      </w:tr>
+      <w:tr>
+        <w:trPr>
+          <w:trHeight w:val="1385"/>
+        </w:trPr>
+        <w:tc>
+          <w:tcPr>
+            <w:tcW w:w="5958" w:type="dxa"/>
+            <w:gridSpan w:val="5"/>
+            <w:tcBorders>
+              <w:top w:val="single" w:sz="4" w:space="0" w:color="000000"/>
+              <w:left w:val="single" w:sz="4" w:space="0" w:color="000000"/>
+              <w:bottom w:val="single" w:sz="4" w:space="0" w:color="000000"/>
+              <w:right w:val="single" w:sz="4" w:space="0" w:color="000000"/>
+            </w:tcBorders>
+            <w:hideMark/>
+          </w:tcPr>
+          <w:p>
+            <w:pPr>
+              <w:rPr>
+                <w:lang w:val="es-419"/>
+              </w:rPr>
+            </w:pPr>
+            <w:r>
+              <w:rPr>
+                <w:b/>
+                <w:lang w:val="es-419"/>
+              </w:rPr>
+              <w:lastRenderedPageBreak/>
+              <w:t>Resumen</w:t>
+            </w:r>
+          </w:p>
+          <w:p>
+            <w:pPr>
+              <w:rPr>
+                <w:b/>
+                <w:lang w:val="es-419"/>
+              </w:rPr>
+            </w:pPr>
+          </w:p>
+        </w:tc>
+        <w:tc>
+          <w:tcPr>
+            <w:tcW w:w="3965" w:type="dxa"/>
+            <w:gridSpan w:val="2"/>
+            <w:tcBorders>
+              <w:top w:val="single" w:sz="4" w:space="0" w:color="000000"/>
+              <w:left w:val="single" w:sz="4" w:space="0" w:color="000000"/>
+              <w:bottom w:val="single" w:sz="4" w:space="0" w:color="000000"/>
+              <w:right w:val="single" w:sz="4" w:space="0" w:color="000000"/>
+            </w:tcBorders>
+            <w:hideMark/>
+          </w:tcPr>
+          <w:p>
+            <w:pPr>
+              <w:rPr>
+                <w:b/>
+                <w:lang w:val="es-419"/>
+              </w:rPr>
+            </w:pPr>
+            <w:r>
+              <w:rPr>
+                <w:b/>
+                <w:lang w:val="es-419"/>
+              </w:rPr>
+              <w:t>Recomendaciones</w:t>
+            </w:r>
+          </w:p>
+          <w:p>
+            <w:pPr>
+              <w:rPr>
+                <w:b/>
+                <w:lang w:val="es-419"/>
+              </w:rPr>
+            </w:pPr>
+          </w:p>
+        </w:tc>
+      </w:tr>
+    </w:tbl>
+    <w:p/>
+    <w:p>
+      <w:pPr>
         <w:rPr>
-          <w:b/>
-          <w:bCs/>
+          <w:lang w:val="es-MX"/>
         </w:rPr>
       </w:pPr>
+      <w:r>
+        <w:rPr>
+          <w:lang w:val="es-MX"/>
+        </w:rPr>
+        <w:br w:type="page"/>
+      </w:r>
     </w:p>
+    <w:p>
+      <w:pPr>
+        <w:pStyle w:val="Ttulo2"/>
+        <w:rPr>
+          <w:lang w:val="es-MX"/>
+        </w:rPr>
+      </w:pPr>
+      <w:bookmarkStart w:id="8" w:name="_Toc224582856"/>
+      <w:r>
+        <w:rPr>
+          <w:lang w:val="es-MX"/>
+        </w:rPr>
+        <w:lastRenderedPageBreak/>
+        <w:t>Recibir automóvil para lavado</w:t>
+      </w:r>
+      <w:bookmarkEnd w:id="8"/>
+    </w:p>
+    <w:tbl>
+      <w:tblPr>
+        <w:tblW w:w="9930" w:type="dxa"/>
+        <w:tblBorders>
+          <w:top w:val="single" w:sz="4" w:space="0" w:color="000000"/>
+          <w:left w:val="single" w:sz="4" w:space="0" w:color="000000"/>
+          <w:bottom w:val="single" w:sz="4" w:space="0" w:color="000000"/>
+          <w:right w:val="single" w:sz="4" w:space="0" w:color="000000"/>
+          <w:insideH w:val="single" w:sz="4" w:space="0" w:color="000000"/>
+          <w:insideV w:val="single" w:sz="4" w:space="0" w:color="000000"/>
+        </w:tblBorders>
+        <w:tblLayout w:type="fixed"/>
+        <w:tblLook w:val="00A0" w:firstRow="1" w:lastRow="0" w:firstColumn="1" w:lastColumn="0" w:noHBand="0" w:noVBand="0"/>
+      </w:tblPr>
+      <w:tblGrid>
+        <w:gridCol w:w="2810"/>
+        <w:gridCol w:w="363"/>
+        <w:gridCol w:w="1621"/>
+        <w:gridCol w:w="168"/>
+        <w:gridCol w:w="1000"/>
+        <w:gridCol w:w="354"/>
+        <w:gridCol w:w="3614"/>
+      </w:tblGrid>
+      <w:tr>
+        <w:tc>
+          <w:tcPr>
+            <w:tcW w:w="2808" w:type="dxa"/>
+            <w:tcBorders>
+              <w:top w:val="single" w:sz="4" w:space="0" w:color="000000"/>
+              <w:left w:val="single" w:sz="4" w:space="0" w:color="000000"/>
+              <w:bottom w:val="single" w:sz="4" w:space="0" w:color="000000"/>
+              <w:right w:val="single" w:sz="4" w:space="0" w:color="000000"/>
+            </w:tcBorders>
+            <w:hideMark/>
+          </w:tcPr>
+          <w:p>
+            <w:pPr>
+              <w:rPr>
+                <w:b/>
+                <w:lang w:val="es-419"/>
+              </w:rPr>
+            </w:pPr>
+            <w:r>
+              <w:rPr>
+                <w:b/>
+                <w:lang w:val="es-419"/>
+              </w:rPr>
+              <w:t>Nombre de Requerimiento:</w:t>
+            </w:r>
+          </w:p>
+          <w:p>
+            <w:pPr>
+              <w:rPr>
+                <w:b/>
+                <w:lang w:val="es-419"/>
+              </w:rPr>
+            </w:pPr>
+            <w:r>
+              <w:rPr>
+                <w:b/>
+                <w:lang w:val="es-419"/>
+              </w:rPr>
+              <w:t>Recibir automóvil para lavado</w:t>
+            </w:r>
+          </w:p>
+          <w:p>
+            <w:pPr>
+              <w:rPr>
+                <w:lang w:val="es-419"/>
+              </w:rPr>
+            </w:pPr>
+          </w:p>
+        </w:tc>
+        <w:tc>
+          <w:tcPr>
+            <w:tcW w:w="3150" w:type="dxa"/>
+            <w:gridSpan w:val="4"/>
+            <w:tcBorders>
+              <w:top w:val="single" w:sz="4" w:space="0" w:color="000000"/>
+              <w:left w:val="single" w:sz="4" w:space="0" w:color="000000"/>
+              <w:bottom w:val="single" w:sz="4" w:space="0" w:color="000000"/>
+              <w:right w:val="single" w:sz="4" w:space="0" w:color="000000"/>
+            </w:tcBorders>
+            <w:hideMark/>
+          </w:tcPr>
+          <w:p>
+            <w:pPr>
+              <w:rPr>
+                <w:b/>
+                <w:lang w:val="es-419"/>
+              </w:rPr>
+            </w:pPr>
+            <w:r>
+              <w:rPr>
+                <w:b/>
+                <w:lang w:val="es-419"/>
+              </w:rPr>
+              <w:t>Encargado</w:t>
+            </w:r>
+            <w:r>
+              <w:rPr>
+                <w:b/>
+                <w:lang w:val="es-419"/>
+              </w:rPr>
+              <w:t>:</w:t>
+            </w:r>
+          </w:p>
+          <w:p>
+            <w:pPr>
+              <w:rPr>
+                <w:bCs/>
+                <w:lang w:val="es-419"/>
+              </w:rPr>
+            </w:pPr>
+          </w:p>
+        </w:tc>
+        <w:tc>
+          <w:tcPr>
+            <w:tcW w:w="3965" w:type="dxa"/>
+            <w:gridSpan w:val="2"/>
+            <w:tcBorders>
+              <w:top w:val="single" w:sz="4" w:space="0" w:color="000000"/>
+              <w:left w:val="single" w:sz="4" w:space="0" w:color="000000"/>
+              <w:bottom w:val="single" w:sz="4" w:space="0" w:color="000000"/>
+              <w:right w:val="single" w:sz="4" w:space="0" w:color="000000"/>
+            </w:tcBorders>
+            <w:hideMark/>
+          </w:tcPr>
+          <w:p>
+            <w:pPr>
+              <w:rPr>
+                <w:lang w:val="es-419"/>
+              </w:rPr>
+            </w:pPr>
+            <w:r>
+              <w:rPr>
+                <w:b/>
+                <w:lang w:val="es-419"/>
+              </w:rPr>
+              <w:t>Cliente</w:t>
+            </w:r>
+            <w:r>
+              <w:rPr>
+                <w:b/>
+                <w:lang w:val="es-419"/>
+              </w:rPr>
+              <w:t>:</w:t>
+            </w:r>
+          </w:p>
+          <w:p>
+            <w:pPr>
+              <w:rPr>
+                <w:lang w:val="es-419"/>
+              </w:rPr>
+            </w:pPr>
+          </w:p>
+        </w:tc>
+      </w:tr>
+      <w:tr>
+        <w:trPr>
+          <w:trHeight w:val="1484"/>
+        </w:trPr>
+        <w:tc>
+          <w:tcPr>
+            <w:tcW w:w="9923" w:type="dxa"/>
+            <w:gridSpan w:val="7"/>
+            <w:tcBorders>
+              <w:top w:val="single" w:sz="4" w:space="0" w:color="000000"/>
+              <w:left w:val="single" w:sz="4" w:space="0" w:color="000000"/>
+              <w:bottom w:val="single" w:sz="4" w:space="0" w:color="000000"/>
+              <w:right w:val="single" w:sz="4" w:space="0" w:color="000000"/>
+            </w:tcBorders>
+            <w:hideMark/>
+          </w:tcPr>
+          <w:p>
+            <w:pPr>
+              <w:rPr>
+                <w:b/>
+                <w:lang w:val="es-419"/>
+              </w:rPr>
+            </w:pPr>
+            <w:r>
+              <w:rPr>
+                <w:b/>
+                <w:lang w:val="es-419"/>
+              </w:rPr>
+              <w:t>Descripción del requerimiento</w:t>
+            </w:r>
+            <w:r>
+              <w:rPr>
+                <w:b/>
+                <w:lang w:val="es-419"/>
+              </w:rPr>
+              <w:t>:</w:t>
+            </w:r>
+          </w:p>
+          <w:p>
+            <w:pPr>
+              <w:rPr>
+                <w:lang w:val="es-419"/>
+              </w:rPr>
+            </w:pPr>
+          </w:p>
+        </w:tc>
+      </w:tr>
+      <w:tr>
+        <w:trPr>
+          <w:trHeight w:val="2240"/>
+        </w:trPr>
+        <w:tc>
+          <w:tcPr>
+            <w:tcW w:w="4959" w:type="dxa"/>
+            <w:gridSpan w:val="4"/>
+            <w:tcBorders>
+              <w:top w:val="single" w:sz="4" w:space="0" w:color="000000"/>
+              <w:left w:val="single" w:sz="4" w:space="0" w:color="000000"/>
+              <w:bottom w:val="single" w:sz="4" w:space="0" w:color="000000"/>
+              <w:right w:val="single" w:sz="4" w:space="0" w:color="000000"/>
+            </w:tcBorders>
+            <w:hideMark/>
+          </w:tcPr>
+          <w:p>
+            <w:pPr>
+              <w:rPr>
+                <w:b/>
+                <w:lang w:val="es-419"/>
+              </w:rPr>
+            </w:pPr>
+            <w:r>
+              <w:rPr>
+                <w:b/>
+                <w:lang w:val="es-419"/>
+              </w:rPr>
+              <w:t>Salida Esperada:</w:t>
+            </w:r>
+          </w:p>
+          <w:p>
+            <w:pPr>
+              <w:rPr>
+                <w:lang w:val="es-419"/>
+              </w:rPr>
+            </w:pPr>
+          </w:p>
+        </w:tc>
+        <w:tc>
+          <w:tcPr>
+            <w:tcW w:w="4964" w:type="dxa"/>
+            <w:gridSpan w:val="3"/>
+            <w:tcBorders>
+              <w:top w:val="single" w:sz="4" w:space="0" w:color="000000"/>
+              <w:left w:val="single" w:sz="4" w:space="0" w:color="000000"/>
+              <w:bottom w:val="single" w:sz="4" w:space="0" w:color="000000"/>
+              <w:right w:val="single" w:sz="4" w:space="0" w:color="000000"/>
+            </w:tcBorders>
+            <w:hideMark/>
+          </w:tcPr>
+          <w:p>
+            <w:pPr>
+              <w:rPr>
+                <w:b/>
+                <w:lang w:val="es-419"/>
+              </w:rPr>
+            </w:pPr>
+            <w:r>
+              <w:rPr>
+                <w:b/>
+                <w:lang w:val="es-419"/>
+              </w:rPr>
+              <w:t>Indicadores de la salida</w:t>
+            </w:r>
+            <w:r>
+              <w:rPr>
+                <w:b/>
+                <w:lang w:val="es-419"/>
+              </w:rPr>
+              <w:t>:</w:t>
+            </w:r>
+          </w:p>
+          <w:p>
+            <w:pPr>
+              <w:rPr>
+                <w:lang w:val="es-419"/>
+              </w:rPr>
+            </w:pPr>
+          </w:p>
+        </w:tc>
+      </w:tr>
+      <w:tr>
+        <w:trPr>
+          <w:trHeight w:val="1637"/>
+        </w:trPr>
+        <w:tc>
+          <w:tcPr>
+            <w:tcW w:w="3171" w:type="dxa"/>
+            <w:gridSpan w:val="2"/>
+            <w:tcBorders>
+              <w:top w:val="single" w:sz="4" w:space="0" w:color="000000"/>
+              <w:left w:val="single" w:sz="4" w:space="0" w:color="000000"/>
+              <w:bottom w:val="single" w:sz="4" w:space="0" w:color="000000"/>
+              <w:right w:val="single" w:sz="4" w:space="0" w:color="000000"/>
+            </w:tcBorders>
+            <w:hideMark/>
+          </w:tcPr>
+          <w:p>
+            <w:pPr>
+              <w:rPr>
+                <w:b/>
+                <w:lang w:val="es-419"/>
+              </w:rPr>
+            </w:pPr>
+            <w:r>
+              <w:rPr>
+                <w:b/>
+                <w:lang w:val="es-419"/>
+              </w:rPr>
+              <w:t>Dentro del alcance:</w:t>
+            </w:r>
+          </w:p>
+          <w:p>
+            <w:pPr>
+              <w:numPr>
+                <w:ilvl w:val="0"/>
+                <w:numId w:val="2"/>
+              </w:numPr>
+              <w:rPr>
+                <w:b/>
+                <w:lang w:val="es-419"/>
+              </w:rPr>
+            </w:pPr>
+            <w:r>
+              <w:rPr>
+                <w:b/>
+                <w:lang w:val="es-419"/>
+              </w:rPr>
+              <w:t>…</w:t>
+            </w:r>
+          </w:p>
+          <w:p>
+            <w:pPr>
+              <w:numPr>
+                <w:ilvl w:val="0"/>
+                <w:numId w:val="2"/>
+              </w:numPr>
+              <w:rPr>
+                <w:b/>
+                <w:lang w:val="es-419"/>
+              </w:rPr>
+            </w:pPr>
+            <w:r>
+              <w:rPr>
+                <w:b/>
+                <w:lang w:val="es-419"/>
+              </w:rPr>
+              <w:t>…</w:t>
+            </w:r>
+          </w:p>
+          <w:p>
+            <w:pPr>
+              <w:numPr>
+                <w:ilvl w:val="0"/>
+                <w:numId w:val="2"/>
+              </w:numPr>
+              <w:rPr>
+                <w:b/>
+                <w:lang w:val="es-419"/>
+              </w:rPr>
+            </w:pPr>
+            <w:r>
+              <w:rPr>
+                <w:b/>
+                <w:lang w:val="es-419"/>
+              </w:rPr>
+              <w:t>…</w:t>
+            </w:r>
+          </w:p>
+        </w:tc>
+        <w:tc>
+          <w:tcPr>
+            <w:tcW w:w="3141" w:type="dxa"/>
+            <w:gridSpan w:val="4"/>
+            <w:tcBorders>
+              <w:top w:val="single" w:sz="4" w:space="0" w:color="000000"/>
+              <w:left w:val="single" w:sz="4" w:space="0" w:color="000000"/>
+              <w:bottom w:val="single" w:sz="4" w:space="0" w:color="000000"/>
+              <w:right w:val="single" w:sz="4" w:space="0" w:color="000000"/>
+            </w:tcBorders>
+            <w:hideMark/>
+          </w:tcPr>
+          <w:p>
+            <w:pPr>
+              <w:rPr>
+                <w:b/>
+                <w:lang w:val="es-419"/>
+              </w:rPr>
+            </w:pPr>
+            <w:r>
+              <w:rPr>
+                <w:b/>
+                <w:lang w:val="es-419"/>
+              </w:rPr>
+              <w:t>Fuera de alcance:</w:t>
+            </w:r>
+          </w:p>
+          <w:p>
+            <w:pPr>
+              <w:numPr>
+                <w:ilvl w:val="0"/>
+                <w:numId w:val="2"/>
+              </w:numPr>
+              <w:rPr>
+                <w:b/>
+                <w:lang w:val="es-419"/>
+              </w:rPr>
+            </w:pPr>
+            <w:r>
+              <w:rPr>
+                <w:b/>
+                <w:lang w:val="es-419"/>
+              </w:rPr>
+              <w:t>…</w:t>
+            </w:r>
+          </w:p>
+          <w:p>
+            <w:pPr>
+              <w:numPr>
+                <w:ilvl w:val="0"/>
+                <w:numId w:val="2"/>
+              </w:numPr>
+              <w:rPr>
+                <w:b/>
+                <w:lang w:val="es-419"/>
+              </w:rPr>
+            </w:pPr>
+            <w:r>
+              <w:rPr>
+                <w:b/>
+                <w:lang w:val="es-419"/>
+              </w:rPr>
+              <w:t>…</w:t>
+            </w:r>
+          </w:p>
+          <w:p>
+            <w:pPr>
+              <w:numPr>
+                <w:ilvl w:val="0"/>
+                <w:numId w:val="2"/>
+              </w:numPr>
+              <w:rPr>
+                <w:b/>
+                <w:lang w:val="es-419"/>
+              </w:rPr>
+            </w:pPr>
+            <w:r>
+              <w:rPr>
+                <w:b/>
+                <w:lang w:val="es-419"/>
+              </w:rPr>
+              <w:t>…</w:t>
+            </w:r>
+          </w:p>
+        </w:tc>
+        <w:tc>
+          <w:tcPr>
+            <w:tcW w:w="3611" w:type="dxa"/>
+            <w:tcBorders>
+              <w:top w:val="single" w:sz="4" w:space="0" w:color="000000"/>
+              <w:left w:val="single" w:sz="4" w:space="0" w:color="000000"/>
+              <w:bottom w:val="single" w:sz="4" w:space="0" w:color="000000"/>
+              <w:right w:val="single" w:sz="4" w:space="0" w:color="000000"/>
+            </w:tcBorders>
+          </w:tcPr>
+          <w:p>
+            <w:pPr>
+              <w:rPr>
+                <w:b/>
+                <w:lang w:val="es-419"/>
+              </w:rPr>
+            </w:pPr>
+            <w:r>
+              <w:rPr>
+                <w:b/>
+                <w:lang w:val="es-419"/>
+              </w:rPr>
+              <w:t>Requisitos no Funcionales</w:t>
+            </w:r>
+            <w:r>
+              <w:rPr>
+                <w:b/>
+                <w:lang w:val="es-419"/>
+              </w:rPr>
+              <w:t>:</w:t>
+            </w:r>
+          </w:p>
+          <w:p>
+            <w:pPr>
+              <w:numPr>
+                <w:ilvl w:val="0"/>
+                <w:numId w:val="2"/>
+              </w:numPr>
+              <w:rPr>
+                <w:b/>
+                <w:lang w:val="es-419"/>
+              </w:rPr>
+            </w:pPr>
+            <w:r>
+              <w:rPr>
+                <w:b/>
+                <w:lang w:val="es-419"/>
+              </w:rPr>
+              <w:t>…</w:t>
+            </w:r>
+          </w:p>
+          <w:p>
+            <w:pPr>
+              <w:numPr>
+                <w:ilvl w:val="0"/>
+                <w:numId w:val="2"/>
+              </w:numPr>
+              <w:rPr>
+                <w:b/>
+                <w:lang w:val="es-419"/>
+              </w:rPr>
+            </w:pPr>
+            <w:r>
+              <w:rPr>
+                <w:b/>
+                <w:lang w:val="es-419"/>
+              </w:rPr>
+              <w:t>…</w:t>
+            </w:r>
+          </w:p>
+          <w:p>
+            <w:pPr>
+              <w:numPr>
+                <w:ilvl w:val="0"/>
+                <w:numId w:val="2"/>
+              </w:numPr>
+              <w:rPr>
+                <w:b/>
+                <w:lang w:val="es-419"/>
+              </w:rPr>
+            </w:pPr>
+            <w:r>
+              <w:rPr>
+                <w:b/>
+                <w:lang w:val="es-419"/>
+              </w:rPr>
+              <w:t>…</w:t>
+            </w:r>
+          </w:p>
+          <w:p>
+            <w:pPr>
+              <w:rPr>
+                <w:b/>
+                <w:lang w:val="es-419"/>
+              </w:rPr>
+            </w:pPr>
+          </w:p>
+        </w:tc>
+      </w:tr>
+      <w:tr>
+        <w:trPr>
+          <w:trHeight w:val="1637"/>
+        </w:trPr>
+        <w:tc>
+          <w:tcPr>
+            <w:tcW w:w="4791" w:type="dxa"/>
+            <w:gridSpan w:val="3"/>
+            <w:tcBorders>
+              <w:top w:val="single" w:sz="4" w:space="0" w:color="000000"/>
+              <w:left w:val="single" w:sz="4" w:space="0" w:color="000000"/>
+              <w:bottom w:val="single" w:sz="4" w:space="0" w:color="000000"/>
+              <w:right w:val="single" w:sz="4" w:space="0" w:color="000000"/>
+            </w:tcBorders>
+          </w:tcPr>
+          <w:p>
+            <w:pPr>
+              <w:rPr>
+                <w:b/>
+                <w:lang w:val="es-419"/>
+              </w:rPr>
+            </w:pPr>
+            <w:r>
+              <w:rPr>
+                <w:b/>
+                <w:lang w:val="es-419"/>
+              </w:rPr>
+              <w:t>Producto mínimo viable</w:t>
+            </w:r>
+          </w:p>
+          <w:p>
+            <w:pPr>
+              <w:numPr>
+                <w:ilvl w:val="0"/>
+                <w:numId w:val="2"/>
+              </w:numPr>
+              <w:rPr>
+                <w:lang w:val="es-419"/>
+              </w:rPr>
+            </w:pPr>
+            <w:r>
+              <w:rPr>
+                <w:lang w:val="es-419"/>
+              </w:rPr>
+              <w:t>…</w:t>
+            </w:r>
+          </w:p>
+          <w:p>
+            <w:pPr>
+              <w:numPr>
+                <w:ilvl w:val="0"/>
+                <w:numId w:val="2"/>
+              </w:numPr>
+              <w:rPr>
+                <w:b/>
+                <w:lang w:val="es-419"/>
+              </w:rPr>
+            </w:pPr>
+            <w:r>
+              <w:rPr>
+                <w:b/>
+                <w:lang w:val="es-419"/>
+              </w:rPr>
+              <w:t>…</w:t>
+            </w:r>
+          </w:p>
+          <w:p>
+            <w:pPr>
+              <w:numPr>
+                <w:ilvl w:val="0"/>
+                <w:numId w:val="2"/>
+              </w:numPr>
+              <w:rPr>
+                <w:b/>
+                <w:lang w:val="es-419"/>
+              </w:rPr>
+            </w:pPr>
+            <w:r>
+              <w:rPr>
+                <w:b/>
+                <w:lang w:val="es-419"/>
+              </w:rPr>
+              <w:t>…</w:t>
+            </w:r>
+          </w:p>
+          <w:p>
+            <w:pPr>
+              <w:rPr>
+                <w:b/>
+                <w:lang w:val="es-419"/>
+              </w:rPr>
+            </w:pPr>
+          </w:p>
+        </w:tc>
+        <w:tc>
+          <w:tcPr>
+            <w:tcW w:w="5132" w:type="dxa"/>
+            <w:gridSpan w:val="4"/>
+            <w:tcBorders>
+              <w:top w:val="single" w:sz="4" w:space="0" w:color="000000"/>
+              <w:left w:val="single" w:sz="4" w:space="0" w:color="000000"/>
+              <w:bottom w:val="single" w:sz="4" w:space="0" w:color="000000"/>
+              <w:right w:val="single" w:sz="4" w:space="0" w:color="000000"/>
+            </w:tcBorders>
+          </w:tcPr>
+          <w:p>
+            <w:pPr>
+              <w:rPr>
+                <w:b/>
+                <w:lang w:val="es-419"/>
+              </w:rPr>
+            </w:pPr>
+            <w:r>
+              <w:rPr>
+                <w:b/>
+                <w:lang w:val="es-419"/>
+              </w:rPr>
+              <w:t xml:space="preserve"> </w:t>
+            </w:r>
+            <w:r>
+              <w:rPr>
+                <w:b/>
+                <w:lang w:val="es-419"/>
+              </w:rPr>
+              <w:t>(Opcional) Características Opcionales</w:t>
+            </w:r>
+          </w:p>
+          <w:p>
+            <w:pPr>
+              <w:numPr>
+                <w:ilvl w:val="0"/>
+                <w:numId w:val="2"/>
+              </w:numPr>
+              <w:rPr>
+                <w:lang w:val="es-419"/>
+              </w:rPr>
+            </w:pPr>
+            <w:r>
+              <w:rPr>
+                <w:lang w:val="es-419"/>
+              </w:rPr>
+              <w:t>…</w:t>
+            </w:r>
+          </w:p>
+          <w:p>
+            <w:pPr>
+              <w:numPr>
+                <w:ilvl w:val="0"/>
+                <w:numId w:val="2"/>
+              </w:numPr>
+              <w:rPr>
+                <w:b/>
+                <w:lang w:val="es-419"/>
+              </w:rPr>
+            </w:pPr>
+            <w:r>
+              <w:rPr>
+                <w:b/>
+                <w:lang w:val="es-419"/>
+              </w:rPr>
+              <w:t>…</w:t>
+            </w:r>
+          </w:p>
+          <w:p>
+            <w:pPr>
+              <w:numPr>
+                <w:ilvl w:val="0"/>
+                <w:numId w:val="2"/>
+              </w:numPr>
+              <w:rPr>
+                <w:b/>
+                <w:lang w:val="es-419"/>
+              </w:rPr>
+            </w:pPr>
+            <w:r>
+              <w:rPr>
+                <w:b/>
+                <w:lang w:val="es-419"/>
+              </w:rPr>
+              <w:t>…</w:t>
+            </w:r>
+          </w:p>
+          <w:p>
+            <w:pPr>
+              <w:rPr>
+                <w:b/>
+                <w:lang w:val="es-419"/>
+              </w:rPr>
+            </w:pPr>
+          </w:p>
+        </w:tc>
+      </w:tr>
+      <w:tr>
+        <w:trPr>
+          <w:trHeight w:val="1385"/>
+        </w:trPr>
+        <w:tc>
+          <w:tcPr>
+            <w:tcW w:w="5958" w:type="dxa"/>
+            <w:gridSpan w:val="5"/>
+            <w:tcBorders>
+              <w:top w:val="single" w:sz="4" w:space="0" w:color="000000"/>
+              <w:left w:val="single" w:sz="4" w:space="0" w:color="000000"/>
+              <w:bottom w:val="single" w:sz="4" w:space="0" w:color="000000"/>
+              <w:right w:val="single" w:sz="4" w:space="0" w:color="000000"/>
+            </w:tcBorders>
+            <w:hideMark/>
+          </w:tcPr>
+          <w:p>
+            <w:pPr>
+              <w:rPr>
+                <w:lang w:val="es-419"/>
+              </w:rPr>
+            </w:pPr>
+            <w:r>
+              <w:rPr>
+                <w:b/>
+                <w:lang w:val="es-419"/>
+              </w:rPr>
+              <w:t>Resumen</w:t>
+            </w:r>
+          </w:p>
+          <w:p>
+            <w:pPr>
+              <w:rPr>
+                <w:b/>
+                <w:lang w:val="es-419"/>
+              </w:rPr>
+            </w:pPr>
+          </w:p>
+        </w:tc>
+        <w:tc>
+          <w:tcPr>
+            <w:tcW w:w="3965" w:type="dxa"/>
+            <w:gridSpan w:val="2"/>
+            <w:tcBorders>
+              <w:top w:val="single" w:sz="4" w:space="0" w:color="000000"/>
+              <w:left w:val="single" w:sz="4" w:space="0" w:color="000000"/>
+              <w:bottom w:val="single" w:sz="4" w:space="0" w:color="000000"/>
+              <w:right w:val="single" w:sz="4" w:space="0" w:color="000000"/>
+            </w:tcBorders>
+            <w:hideMark/>
+          </w:tcPr>
+          <w:p>
+            <w:pPr>
+              <w:rPr>
+                <w:b/>
+                <w:lang w:val="es-419"/>
+              </w:rPr>
+            </w:pPr>
+            <w:r>
+              <w:rPr>
+                <w:b/>
+                <w:lang w:val="es-419"/>
+              </w:rPr>
+              <w:t>Recomendaciones</w:t>
+            </w:r>
+          </w:p>
+          <w:p>
+            <w:pPr>
+              <w:rPr>
+                <w:b/>
+                <w:lang w:val="es-419"/>
+              </w:rPr>
+            </w:pPr>
+          </w:p>
+        </w:tc>
+      </w:tr>
+    </w:tbl>
+    <w:p>
+      <w:pPr>
+        <w:pStyle w:val="Ttulo2"/>
+        <w:rPr>
+          <w:lang w:val="es-MX"/>
+        </w:rPr>
+      </w:pPr>
+      <w:bookmarkStart w:id="9" w:name="_Toc224582857"/>
+      <w:r>
+        <w:rPr>
+          <w:lang w:val="es-MX"/>
+        </w:rPr>
+        <w:lastRenderedPageBreak/>
+        <w:t>Liquidar pago empleado</w:t>
+      </w:r>
+      <w:bookmarkEnd w:id="9"/>
+    </w:p>
+    <w:tbl>
+      <w:tblPr>
+        <w:tblW w:w="9930" w:type="dxa"/>
+        <w:tblBorders>
+          <w:top w:val="single" w:sz="4" w:space="0" w:color="000000"/>
+          <w:left w:val="single" w:sz="4" w:space="0" w:color="000000"/>
+          <w:bottom w:val="single" w:sz="4" w:space="0" w:color="000000"/>
+          <w:right w:val="single" w:sz="4" w:space="0" w:color="000000"/>
+          <w:insideH w:val="single" w:sz="4" w:space="0" w:color="000000"/>
+          <w:insideV w:val="single" w:sz="4" w:space="0" w:color="000000"/>
+        </w:tblBorders>
+        <w:tblLayout w:type="fixed"/>
+        <w:tblLook w:val="00A0" w:firstRow="1" w:lastRow="0" w:firstColumn="1" w:lastColumn="0" w:noHBand="0" w:noVBand="0"/>
+      </w:tblPr>
+      <w:tblGrid>
+        <w:gridCol w:w="2810"/>
+        <w:gridCol w:w="363"/>
+        <w:gridCol w:w="1621"/>
+        <w:gridCol w:w="168"/>
+        <w:gridCol w:w="1000"/>
+        <w:gridCol w:w="354"/>
+        <w:gridCol w:w="3614"/>
+      </w:tblGrid>
+      <w:tr>
+        <w:tc>
+          <w:tcPr>
+            <w:tcW w:w="2808" w:type="dxa"/>
+            <w:tcBorders>
+              <w:top w:val="single" w:sz="4" w:space="0" w:color="000000"/>
+              <w:left w:val="single" w:sz="4" w:space="0" w:color="000000"/>
+              <w:bottom w:val="single" w:sz="4" w:space="0" w:color="000000"/>
+              <w:right w:val="single" w:sz="4" w:space="0" w:color="000000"/>
+            </w:tcBorders>
+            <w:hideMark/>
+          </w:tcPr>
+          <w:p>
+            <w:pPr>
+              <w:rPr>
+                <w:b/>
+                <w:lang w:val="es-419"/>
+              </w:rPr>
+            </w:pPr>
+            <w:r>
+              <w:rPr>
+                <w:b/>
+                <w:lang w:val="es-419"/>
+              </w:rPr>
+              <w:t>Nombre de Requerimiento:</w:t>
+            </w:r>
+          </w:p>
+          <w:p>
+            <w:pPr>
+              <w:rPr>
+                <w:b/>
+                <w:lang w:val="es-419"/>
+              </w:rPr>
+            </w:pPr>
+            <w:r>
+              <w:rPr>
+                <w:b/>
+                <w:lang w:val="es-419"/>
+              </w:rPr>
+              <w:t>Liquidar pago empleado</w:t>
+            </w:r>
+          </w:p>
+          <w:p>
+            <w:pPr>
+              <w:rPr>
+                <w:b/>
+                <w:lang w:val="es-419"/>
+              </w:rPr>
+            </w:pPr>
+          </w:p>
+        </w:tc>
+        <w:tc>
+          <w:tcPr>
+            <w:tcW w:w="3150" w:type="dxa"/>
+            <w:gridSpan w:val="4"/>
+            <w:tcBorders>
+              <w:top w:val="single" w:sz="4" w:space="0" w:color="000000"/>
+              <w:left w:val="single" w:sz="4" w:space="0" w:color="000000"/>
+              <w:bottom w:val="single" w:sz="4" w:space="0" w:color="000000"/>
+              <w:right w:val="single" w:sz="4" w:space="0" w:color="000000"/>
+            </w:tcBorders>
+            <w:hideMark/>
+          </w:tcPr>
+          <w:p>
+            <w:pPr>
+              <w:rPr>
+                <w:b/>
+                <w:lang w:val="es-419"/>
+              </w:rPr>
+            </w:pPr>
+            <w:r>
+              <w:rPr>
+                <w:b/>
+                <w:lang w:val="es-419"/>
+              </w:rPr>
+              <w:t>Encargado:</w:t>
+            </w:r>
+          </w:p>
+        </w:tc>
+        <w:tc>
+          <w:tcPr>
+            <w:tcW w:w="3965" w:type="dxa"/>
+            <w:gridSpan w:val="2"/>
+            <w:tcBorders>
+              <w:top w:val="single" w:sz="4" w:space="0" w:color="000000"/>
+              <w:left w:val="single" w:sz="4" w:space="0" w:color="000000"/>
+              <w:bottom w:val="single" w:sz="4" w:space="0" w:color="000000"/>
+              <w:right w:val="single" w:sz="4" w:space="0" w:color="000000"/>
+            </w:tcBorders>
+            <w:hideMark/>
+          </w:tcPr>
+          <w:p>
+            <w:pPr>
+              <w:rPr>
+                <w:lang w:val="es-419"/>
+              </w:rPr>
+            </w:pPr>
+            <w:r>
+              <w:rPr>
+                <w:b/>
+                <w:lang w:val="es-419"/>
+              </w:rPr>
+              <w:t>Cliente:</w:t>
+            </w:r>
+          </w:p>
+        </w:tc>
+      </w:tr>
+      <w:tr>
+        <w:trPr>
+          <w:trHeight w:val="1484"/>
+        </w:trPr>
+        <w:tc>
+          <w:tcPr>
+            <w:tcW w:w="9923" w:type="dxa"/>
+            <w:gridSpan w:val="7"/>
+            <w:tcBorders>
+              <w:top w:val="single" w:sz="4" w:space="0" w:color="000000"/>
+              <w:left w:val="single" w:sz="4" w:space="0" w:color="000000"/>
+              <w:bottom w:val="single" w:sz="4" w:space="0" w:color="000000"/>
+              <w:right w:val="single" w:sz="4" w:space="0" w:color="000000"/>
+            </w:tcBorders>
+            <w:hideMark/>
+          </w:tcPr>
+          <w:p>
+            <w:pPr>
+              <w:rPr>
+                <w:b/>
+                <w:lang w:val="es-419"/>
+              </w:rPr>
+            </w:pPr>
+            <w:r>
+              <w:rPr>
+                <w:b/>
+                <w:lang w:val="es-419"/>
+              </w:rPr>
+              <w:t>Descripción del requerimiento:</w:t>
+            </w:r>
+          </w:p>
+        </w:tc>
+      </w:tr>
+      <w:tr>
+        <w:trPr>
+          <w:trHeight w:val="2240"/>
+        </w:trPr>
+        <w:tc>
+          <w:tcPr>
+            <w:tcW w:w="4959" w:type="dxa"/>
+            <w:gridSpan w:val="4"/>
+            <w:tcBorders>
+              <w:top w:val="single" w:sz="4" w:space="0" w:color="000000"/>
+              <w:left w:val="single" w:sz="4" w:space="0" w:color="000000"/>
+              <w:bottom w:val="single" w:sz="4" w:space="0" w:color="000000"/>
+              <w:right w:val="single" w:sz="4" w:space="0" w:color="000000"/>
+            </w:tcBorders>
+            <w:hideMark/>
+          </w:tcPr>
+          <w:p>
+            <w:pPr>
+              <w:rPr>
+                <w:b/>
+                <w:lang w:val="es-419"/>
+              </w:rPr>
+            </w:pPr>
+            <w:r>
+              <w:rPr>
+                <w:b/>
+                <w:lang w:val="es-419"/>
+              </w:rPr>
+              <w:t>Salida Esperada:</w:t>
+            </w:r>
+          </w:p>
+        </w:tc>
+        <w:tc>
+          <w:tcPr>
+            <w:tcW w:w="4964" w:type="dxa"/>
+            <w:gridSpan w:val="3"/>
+            <w:tcBorders>
+              <w:top w:val="single" w:sz="4" w:space="0" w:color="000000"/>
+              <w:left w:val="single" w:sz="4" w:space="0" w:color="000000"/>
+              <w:bottom w:val="single" w:sz="4" w:space="0" w:color="000000"/>
+              <w:right w:val="single" w:sz="4" w:space="0" w:color="000000"/>
+            </w:tcBorders>
+            <w:hideMark/>
+          </w:tcPr>
+          <w:p>
+            <w:pPr>
+              <w:rPr>
+                <w:b/>
+                <w:lang w:val="es-419"/>
+              </w:rPr>
+            </w:pPr>
+            <w:r>
+              <w:rPr>
+                <w:b/>
+                <w:lang w:val="es-419"/>
+              </w:rPr>
+              <w:t>Indicadores de la salida:</w:t>
+            </w:r>
+          </w:p>
+        </w:tc>
+      </w:tr>
+      <w:tr>
+        <w:trPr>
+          <w:trHeight w:val="1637"/>
+        </w:trPr>
+        <w:tc>
+          <w:tcPr>
+            <w:tcW w:w="3171" w:type="dxa"/>
+            <w:gridSpan w:val="2"/>
+            <w:tcBorders>
+              <w:top w:val="single" w:sz="4" w:space="0" w:color="000000"/>
+              <w:left w:val="single" w:sz="4" w:space="0" w:color="000000"/>
+              <w:bottom w:val="single" w:sz="4" w:space="0" w:color="000000"/>
+              <w:right w:val="single" w:sz="4" w:space="0" w:color="000000"/>
+            </w:tcBorders>
+            <w:hideMark/>
+          </w:tcPr>
+          <w:p>
+            <w:pPr>
+              <w:rPr>
+                <w:b/>
+                <w:lang w:val="es-419"/>
+              </w:rPr>
+            </w:pPr>
+            <w:r>
+              <w:rPr>
+                <w:b/>
+                <w:lang w:val="es-419"/>
+              </w:rPr>
+              <w:t>Dentro del alcance:</w:t>
+            </w:r>
+          </w:p>
+          <w:p>
+            <w:pPr>
+              <w:numPr>
+                <w:ilvl w:val="0"/>
+                <w:numId w:val="7"/>
+              </w:numPr>
+              <w:rPr>
+                <w:b/>
+                <w:lang w:val="es-419"/>
+              </w:rPr>
+            </w:pPr>
+            <w:r>
+              <w:rPr>
+                <w:b/>
+                <w:lang w:val="es-419"/>
+              </w:rPr>
+              <w:t>…</w:t>
+            </w:r>
+          </w:p>
+          <w:p>
+            <w:pPr>
+              <w:numPr>
+                <w:ilvl w:val="0"/>
+                <w:numId w:val="7"/>
+              </w:numPr>
+              <w:rPr>
+                <w:b/>
+                <w:lang w:val="es-419"/>
+              </w:rPr>
+            </w:pPr>
+            <w:r>
+              <w:rPr>
+                <w:b/>
+                <w:lang w:val="es-419"/>
+              </w:rPr>
+              <w:t>…</w:t>
+            </w:r>
+          </w:p>
+          <w:p>
+            <w:pPr>
+              <w:numPr>
+                <w:ilvl w:val="0"/>
+                <w:numId w:val="7"/>
+              </w:numPr>
+              <w:rPr>
+                <w:b/>
+                <w:lang w:val="es-419"/>
+              </w:rPr>
+            </w:pPr>
+            <w:r>
+              <w:rPr>
+                <w:b/>
+                <w:lang w:val="es-419"/>
+              </w:rPr>
+              <w:t>…</w:t>
+            </w:r>
+          </w:p>
+        </w:tc>
+        <w:tc>
+          <w:tcPr>
+            <w:tcW w:w="3141" w:type="dxa"/>
+            <w:gridSpan w:val="4"/>
+            <w:tcBorders>
+              <w:top w:val="single" w:sz="4" w:space="0" w:color="000000"/>
+              <w:left w:val="single" w:sz="4" w:space="0" w:color="000000"/>
+              <w:bottom w:val="single" w:sz="4" w:space="0" w:color="000000"/>
+              <w:right w:val="single" w:sz="4" w:space="0" w:color="000000"/>
+            </w:tcBorders>
+            <w:hideMark/>
+          </w:tcPr>
+          <w:p>
+            <w:pPr>
+              <w:rPr>
+                <w:b/>
+                <w:lang w:val="es-419"/>
+              </w:rPr>
+            </w:pPr>
+            <w:r>
+              <w:rPr>
+                <w:b/>
+                <w:lang w:val="es-419"/>
+              </w:rPr>
+              <w:t>Fuera de alcance:</w:t>
+            </w:r>
+          </w:p>
+          <w:p>
+            <w:pPr>
+              <w:numPr>
+                <w:ilvl w:val="0"/>
+                <w:numId w:val="7"/>
+              </w:numPr>
+              <w:rPr>
+                <w:b/>
+                <w:lang w:val="es-419"/>
+              </w:rPr>
+            </w:pPr>
+            <w:r>
+              <w:rPr>
+                <w:b/>
+                <w:lang w:val="es-419"/>
+              </w:rPr>
+              <w:t>…</w:t>
+            </w:r>
+          </w:p>
+          <w:p>
+            <w:pPr>
+              <w:numPr>
+                <w:ilvl w:val="0"/>
+                <w:numId w:val="7"/>
+              </w:numPr>
+              <w:rPr>
+                <w:b/>
+                <w:lang w:val="es-419"/>
+              </w:rPr>
+            </w:pPr>
+            <w:r>
+              <w:rPr>
+                <w:b/>
+                <w:lang w:val="es-419"/>
+              </w:rPr>
+              <w:t>…</w:t>
+            </w:r>
+          </w:p>
+          <w:p>
+            <w:pPr>
+              <w:numPr>
+                <w:ilvl w:val="0"/>
+                <w:numId w:val="7"/>
+              </w:numPr>
+              <w:rPr>
+                <w:b/>
+                <w:lang w:val="es-419"/>
+              </w:rPr>
+            </w:pPr>
+            <w:r>
+              <w:rPr>
+                <w:b/>
+                <w:lang w:val="es-419"/>
+              </w:rPr>
+              <w:t>…</w:t>
+            </w:r>
+          </w:p>
+        </w:tc>
+        <w:tc>
+          <w:tcPr>
+            <w:tcW w:w="3611" w:type="dxa"/>
+            <w:tcBorders>
+              <w:top w:val="single" w:sz="4" w:space="0" w:color="000000"/>
+              <w:left w:val="single" w:sz="4" w:space="0" w:color="000000"/>
+              <w:bottom w:val="single" w:sz="4" w:space="0" w:color="000000"/>
+              <w:right w:val="single" w:sz="4" w:space="0" w:color="000000"/>
+            </w:tcBorders>
+          </w:tcPr>
+          <w:p>
+            <w:pPr>
+              <w:rPr>
+                <w:b/>
+                <w:lang w:val="es-419"/>
+              </w:rPr>
+            </w:pPr>
+            <w:r>
+              <w:rPr>
+                <w:b/>
+                <w:lang w:val="es-419"/>
+              </w:rPr>
+              <w:t>Requisitos no Funcionales:</w:t>
+            </w:r>
+          </w:p>
+          <w:p>
+            <w:pPr>
+              <w:numPr>
+                <w:ilvl w:val="0"/>
+                <w:numId w:val="7"/>
+              </w:numPr>
+              <w:rPr>
+                <w:b/>
+                <w:lang w:val="es-419"/>
+              </w:rPr>
+            </w:pPr>
+            <w:r>
+              <w:rPr>
+                <w:b/>
+                <w:lang w:val="es-419"/>
+              </w:rPr>
+              <w:t>…</w:t>
+            </w:r>
+          </w:p>
+          <w:p>
+            <w:pPr>
+              <w:numPr>
+                <w:ilvl w:val="0"/>
+                <w:numId w:val="7"/>
+              </w:numPr>
+              <w:rPr>
+                <w:b/>
+                <w:lang w:val="es-419"/>
+              </w:rPr>
+            </w:pPr>
+            <w:r>
+              <w:rPr>
+                <w:b/>
+                <w:lang w:val="es-419"/>
+              </w:rPr>
+              <w:t>…</w:t>
+            </w:r>
+          </w:p>
+          <w:p>
+            <w:pPr>
+              <w:numPr>
+                <w:ilvl w:val="0"/>
+                <w:numId w:val="7"/>
+              </w:numPr>
+              <w:rPr>
+                <w:b/>
+                <w:lang w:val="es-419"/>
+              </w:rPr>
+            </w:pPr>
+            <w:r>
+              <w:rPr>
+                <w:b/>
+                <w:lang w:val="es-419"/>
+              </w:rPr>
+              <w:t>…</w:t>
+            </w:r>
+          </w:p>
+          <w:p>
+            <w:pPr>
+              <w:rPr>
+                <w:b/>
+                <w:lang w:val="es-419"/>
+              </w:rPr>
+            </w:pPr>
+          </w:p>
+        </w:tc>
+      </w:tr>
+      <w:tr>
+        <w:trPr>
+          <w:trHeight w:val="1637"/>
+        </w:trPr>
+        <w:tc>
+          <w:tcPr>
+            <w:tcW w:w="4791" w:type="dxa"/>
+            <w:gridSpan w:val="3"/>
+            <w:tcBorders>
+              <w:top w:val="single" w:sz="4" w:space="0" w:color="000000"/>
+              <w:left w:val="single" w:sz="4" w:space="0" w:color="000000"/>
+              <w:bottom w:val="single" w:sz="4" w:space="0" w:color="000000"/>
+              <w:right w:val="single" w:sz="4" w:space="0" w:color="000000"/>
+            </w:tcBorders>
+          </w:tcPr>
+          <w:p>
+            <w:pPr>
+              <w:rPr>
+                <w:b/>
+                <w:lang w:val="es-419"/>
+              </w:rPr>
+            </w:pPr>
+            <w:r>
+              <w:rPr>
+                <w:b/>
+                <w:lang w:val="es-419"/>
+              </w:rPr>
+              <w:t>Producto mínimo viable</w:t>
+            </w:r>
+          </w:p>
+          <w:p>
+            <w:pPr>
+              <w:numPr>
+                <w:ilvl w:val="0"/>
+                <w:numId w:val="7"/>
+              </w:numPr>
+              <w:rPr>
+                <w:lang w:val="es-419"/>
+              </w:rPr>
+            </w:pPr>
+            <w:r>
+              <w:rPr>
+                <w:lang w:val="es-419"/>
+              </w:rPr>
+              <w:t>…</w:t>
+            </w:r>
+          </w:p>
+          <w:p>
+            <w:pPr>
+              <w:numPr>
+                <w:ilvl w:val="0"/>
+                <w:numId w:val="7"/>
+              </w:numPr>
+              <w:rPr>
+                <w:b/>
+                <w:lang w:val="es-419"/>
+              </w:rPr>
+            </w:pPr>
+            <w:r>
+              <w:rPr>
+                <w:b/>
+                <w:lang w:val="es-419"/>
+              </w:rPr>
+              <w:t>…</w:t>
+            </w:r>
+          </w:p>
+          <w:p>
+            <w:pPr>
+              <w:numPr>
+                <w:ilvl w:val="0"/>
+                <w:numId w:val="7"/>
+              </w:numPr>
+              <w:rPr>
+                <w:b/>
+                <w:lang w:val="es-419"/>
+              </w:rPr>
+            </w:pPr>
+            <w:r>
+              <w:rPr>
+                <w:b/>
+                <w:lang w:val="es-419"/>
+              </w:rPr>
+              <w:t>…</w:t>
+            </w:r>
+          </w:p>
+          <w:p>
+            <w:pPr>
+              <w:rPr>
+                <w:b/>
+                <w:lang w:val="es-419"/>
+              </w:rPr>
+            </w:pPr>
+          </w:p>
+        </w:tc>
+        <w:tc>
+          <w:tcPr>
+            <w:tcW w:w="5132" w:type="dxa"/>
+            <w:gridSpan w:val="4"/>
+            <w:tcBorders>
+              <w:top w:val="single" w:sz="4" w:space="0" w:color="000000"/>
+              <w:left w:val="single" w:sz="4" w:space="0" w:color="000000"/>
+              <w:bottom w:val="single" w:sz="4" w:space="0" w:color="000000"/>
+              <w:right w:val="single" w:sz="4" w:space="0" w:color="000000"/>
+            </w:tcBorders>
+          </w:tcPr>
+          <w:p>
+            <w:pPr>
+              <w:rPr>
+                <w:b/>
+                <w:lang w:val="es-419"/>
+              </w:rPr>
+            </w:pPr>
+            <w:r>
+              <w:rPr>
+                <w:b/>
+                <w:lang w:val="es-419"/>
+              </w:rPr>
+              <w:t xml:space="preserve"> (Opcional) Características Opcionales</w:t>
+            </w:r>
+          </w:p>
+          <w:p>
+            <w:pPr>
+              <w:numPr>
+                <w:ilvl w:val="0"/>
+                <w:numId w:val="7"/>
+              </w:numPr>
+              <w:rPr>
+                <w:lang w:val="es-419"/>
+              </w:rPr>
+            </w:pPr>
+            <w:r>
+              <w:rPr>
+                <w:lang w:val="es-419"/>
+              </w:rPr>
+              <w:t>…</w:t>
+            </w:r>
+          </w:p>
+          <w:p>
+            <w:pPr>
+              <w:numPr>
+                <w:ilvl w:val="0"/>
+                <w:numId w:val="7"/>
+              </w:numPr>
+              <w:rPr>
+                <w:b/>
+                <w:lang w:val="es-419"/>
+              </w:rPr>
+            </w:pPr>
+            <w:r>
+              <w:rPr>
+                <w:b/>
+                <w:lang w:val="es-419"/>
+              </w:rPr>
+              <w:t>…</w:t>
+            </w:r>
+          </w:p>
+          <w:p>
+            <w:pPr>
+              <w:numPr>
+                <w:ilvl w:val="0"/>
+                <w:numId w:val="7"/>
+              </w:numPr>
+              <w:rPr>
+                <w:b/>
+                <w:lang w:val="es-419"/>
+              </w:rPr>
+            </w:pPr>
+            <w:r>
+              <w:rPr>
+                <w:b/>
+                <w:lang w:val="es-419"/>
+              </w:rPr>
+              <w:t>…</w:t>
+            </w:r>
+          </w:p>
+          <w:p>
+            <w:pPr>
+              <w:rPr>
+                <w:b/>
+                <w:lang w:val="es-419"/>
+              </w:rPr>
+            </w:pPr>
+          </w:p>
+        </w:tc>
+      </w:tr>
+      <w:tr>
+        <w:trPr>
+          <w:trHeight w:val="1385"/>
+        </w:trPr>
+        <w:tc>
+          <w:tcPr>
+            <w:tcW w:w="5958" w:type="dxa"/>
+            <w:gridSpan w:val="5"/>
+            <w:tcBorders>
+              <w:top w:val="single" w:sz="4" w:space="0" w:color="000000"/>
+              <w:left w:val="single" w:sz="4" w:space="0" w:color="000000"/>
+              <w:bottom w:val="single" w:sz="4" w:space="0" w:color="000000"/>
+              <w:right w:val="single" w:sz="4" w:space="0" w:color="000000"/>
+            </w:tcBorders>
+            <w:hideMark/>
+          </w:tcPr>
+          <w:p>
+            <w:pPr>
+              <w:rPr>
+                <w:lang w:val="es-419"/>
+              </w:rPr>
+            </w:pPr>
+            <w:r>
+              <w:rPr>
+                <w:b/>
+                <w:lang w:val="es-419"/>
+              </w:rPr>
+              <w:t>Resumen</w:t>
+            </w:r>
+          </w:p>
+        </w:tc>
+        <w:tc>
+          <w:tcPr>
+            <w:tcW w:w="3965" w:type="dxa"/>
+            <w:gridSpan w:val="2"/>
+            <w:tcBorders>
+              <w:top w:val="single" w:sz="4" w:space="0" w:color="000000"/>
+              <w:left w:val="single" w:sz="4" w:space="0" w:color="000000"/>
+              <w:bottom w:val="single" w:sz="4" w:space="0" w:color="000000"/>
+              <w:right w:val="single" w:sz="4" w:space="0" w:color="000000"/>
+            </w:tcBorders>
+            <w:hideMark/>
+          </w:tcPr>
+          <w:p>
+            <w:pPr>
+              <w:rPr>
+                <w:b/>
+                <w:lang w:val="es-419"/>
+              </w:rPr>
+            </w:pPr>
+            <w:r>
+              <w:rPr>
+                <w:b/>
+                <w:lang w:val="es-419"/>
+              </w:rPr>
+              <w:t>Recomendaciones</w:t>
+            </w:r>
+          </w:p>
+        </w:tc>
+      </w:tr>
+    </w:tbl>
     <w:p>
       <w:pPr>
         <w:rPr>
@@ -3903,6 +6957,18 @@
   <w:num w:numId="6" w16cid:durableId="791871692">
     <w:abstractNumId w:val="0"/>
   </w:num>
+  <w:num w:numId="7" w16cid:durableId="1510293379">
+    <w:abstractNumId w:val="1"/>
+    <w:lvlOverride w:ilvl="0"/>
+    <w:lvlOverride w:ilvl="1"/>
+    <w:lvlOverride w:ilvl="2"/>
+    <w:lvlOverride w:ilvl="3"/>
+    <w:lvlOverride w:ilvl="4"/>
+    <w:lvlOverride w:ilvl="5"/>
+    <w:lvlOverride w:ilvl="6"/>
+    <w:lvlOverride w:ilvl="7"/>
+    <w:lvlOverride w:ilvl="8"/>
+  </w:num>
 </w:numbering>
 </file>
 
@@ -4306,7 +7372,7 @@
   <w:style w:type="paragraph" w:default="1" w:styleId="Normal">
     <w:name w:val="Normal"/>
     <w:qFormat/>
-    <w:rsid w:val="009D6314"/>
+    <w:rsid w:val="005A692A"/>
   </w:style>
   <w:style w:type="paragraph" w:styleId="Ttulo1">
     <w:name w:val="heading 1"/>
@@ -4509,7 +7575,6 @@
   <w:style w:type="character" w:default="1" w:styleId="Fuentedeprrafopredeter">
     <w:name w:val="Default Paragraph Font"/>
     <w:uiPriority w:val="1"/>
-    <w:semiHidden/>
     <w:unhideWhenUsed/>
   </w:style>
   <w:style w:type="table" w:default="1" w:styleId="Tablanormal">

</xml_diff>